<commit_message>
Add final Run 22 validation and test results
Co-Authored-By: Claude Opus 5.5 <noreply@anthropic.com>
</commit_message>
<xml_diff>
--- a/paper/CIPHER_AI2_IEEE_Paper.docx
+++ b/paper/CIPHER_AI2_IEEE_Paper.docx
@@ -875,9 +875,8 @@
           <w:b/>
           <w:i w:val="0"/>
           <w:sz w:val="18"/>
-          <w:highlight w:val="yellow"/>
-        </w:rPr>
-        <w:t>[TBD]</w:t>
+        </w:rPr>
+        <w:t>61.3%</w:t>
       </w:r>
       <w:r>
         <w:rPr>
@@ -905,7 +904,7 @@
           <w:i w:val="0"/>
           <w:sz w:val="18"/>
         </w:rPr>
-        <w:t>. Surface damage was the hardest class. A Streamlit application runs both stages on uploaded photos.</w:t>
+        <w:t>. Rot was the most stable class and surface damage the hardest. A Streamlit application runs both stages on uploaded photos.</w:t>
       </w:r>
     </w:p>
     <w:p>
@@ -3625,7 +3624,7 @@
                 <w:b w:val="0"/>
                 <w:sz w:val="15"/>
               </w:rPr>
-              <w:t>0.458</w:t>
+              <w:t>0.457</w:t>
             </w:r>
           </w:p>
         </w:tc>
@@ -3727,7 +3726,7 @@
           <w:i w:val="0"/>
           <w:sz w:val="20"/>
         </w:rPr>
-        <w:t>78.5%</w:t>
+        <w:t>80.9%</w:t>
       </w:r>
       <w:r>
         <w:rPr>
@@ -3745,7 +3744,7 @@
           <w:i w:val="0"/>
           <w:sz w:val="20"/>
         </w:rPr>
-        <w:t>64.5%</w:t>
+        <w:t>68.0%</w:t>
       </w:r>
       <w:r>
         <w:rPr>
@@ -3781,7 +3780,7 @@
           <w:i w:val="0"/>
           <w:sz w:val="20"/>
         </w:rPr>
-        <w:t>45.8%</w:t>
+        <w:t>45.7%</w:t>
       </w:r>
       <w:r>
         <w:rPr>
@@ -4002,9 +4001,8 @@
                 <w:rFonts w:ascii="Times New Roman" w:hAnsi="Times New Roman"/>
                 <w:b w:val="0"/>
                 <w:sz w:val="15"/>
-                <w:highlight w:val="yellow"/>
-              </w:rPr>
-              <w:t>[TBD]</w:t>
+              </w:rPr>
+              <w:t>0.847</w:t>
             </w:r>
           </w:p>
         </w:tc>
@@ -4029,9 +4027,8 @@
                 <w:rFonts w:ascii="Times New Roman" w:hAnsi="Times New Roman"/>
                 <w:b w:val="0"/>
                 <w:sz w:val="15"/>
-                <w:highlight w:val="yellow"/>
-              </w:rPr>
-              <w:t>[TBD]</w:t>
+              </w:rPr>
+              <w:t>0.744</w:t>
             </w:r>
           </w:p>
         </w:tc>
@@ -4056,9 +4053,8 @@
                 <w:rFonts w:ascii="Times New Roman" w:hAnsi="Times New Roman"/>
                 <w:b w:val="0"/>
                 <w:sz w:val="15"/>
-                <w:highlight w:val="yellow"/>
-              </w:rPr>
-              <w:t>[TBD]</w:t>
+              </w:rPr>
+              <w:t>0.777</w:t>
             </w:r>
           </w:p>
         </w:tc>
@@ -4083,9 +4079,8 @@
                 <w:rFonts w:ascii="Times New Roman" w:hAnsi="Times New Roman"/>
                 <w:b w:val="0"/>
                 <w:sz w:val="15"/>
-                <w:highlight w:val="yellow"/>
-              </w:rPr>
-              <w:t>[TBD]</w:t>
+              </w:rPr>
+              <w:t>0.594</w:t>
             </w:r>
           </w:p>
         </w:tc>
@@ -4138,9 +4133,8 @@
                 <w:rFonts w:ascii="Times New Roman" w:hAnsi="Times New Roman"/>
                 <w:b w:val="0"/>
                 <w:sz w:val="15"/>
-                <w:highlight w:val="yellow"/>
-              </w:rPr>
-              <w:t>[TBD]</w:t>
+              </w:rPr>
+              <w:t>0.931</w:t>
             </w:r>
           </w:p>
         </w:tc>
@@ -4165,9 +4159,8 @@
                 <w:rFonts w:ascii="Times New Roman" w:hAnsi="Times New Roman"/>
                 <w:b w:val="0"/>
                 <w:sz w:val="15"/>
-                <w:highlight w:val="yellow"/>
-              </w:rPr>
-              <w:t>[TBD]</w:t>
+              </w:rPr>
+              <w:t>0.713</w:t>
             </w:r>
           </w:p>
         </w:tc>
@@ -4192,9 +4185,8 @@
                 <w:rFonts w:ascii="Times New Roman" w:hAnsi="Times New Roman"/>
                 <w:b w:val="0"/>
                 <w:sz w:val="15"/>
-                <w:highlight w:val="yellow"/>
-              </w:rPr>
-              <w:t>[TBD]</w:t>
+              </w:rPr>
+              <w:t>0.761</w:t>
             </w:r>
           </w:p>
         </w:tc>
@@ -4219,9 +4211,8 @@
                 <w:rFonts w:ascii="Times New Roman" w:hAnsi="Times New Roman"/>
                 <w:b w:val="0"/>
                 <w:sz w:val="15"/>
-                <w:highlight w:val="yellow"/>
-              </w:rPr>
-              <w:t>[TBD]</w:t>
+              </w:rPr>
+              <w:t>0.732</w:t>
             </w:r>
           </w:p>
         </w:tc>
@@ -4274,9 +4265,8 @@
                 <w:rFonts w:ascii="Times New Roman" w:hAnsi="Times New Roman"/>
                 <w:b w:val="0"/>
                 <w:sz w:val="15"/>
-                <w:highlight w:val="yellow"/>
-              </w:rPr>
-              <w:t>[TBD]</w:t>
+              </w:rPr>
+              <w:t>0.648</w:t>
             </w:r>
           </w:p>
         </w:tc>
@@ -4301,9 +4291,8 @@
                 <w:rFonts w:ascii="Times New Roman" w:hAnsi="Times New Roman"/>
                 <w:b w:val="0"/>
                 <w:sz w:val="15"/>
-                <w:highlight w:val="yellow"/>
-              </w:rPr>
-              <w:t>[TBD]</w:t>
+              </w:rPr>
+              <w:t>0.584</w:t>
             </w:r>
           </w:p>
         </w:tc>
@@ -4328,9 +4317,8 @@
                 <w:rFonts w:ascii="Times New Roman" w:hAnsi="Times New Roman"/>
                 <w:b w:val="0"/>
                 <w:sz w:val="15"/>
-                <w:highlight w:val="yellow"/>
-              </w:rPr>
-              <w:t>[TBD]</w:t>
+              </w:rPr>
+              <w:t>0.527</w:t>
             </w:r>
           </w:p>
         </w:tc>
@@ -4355,9 +4343,8 @@
                 <w:rFonts w:ascii="Times New Roman" w:hAnsi="Times New Roman"/>
                 <w:b w:val="0"/>
                 <w:sz w:val="15"/>
-                <w:highlight w:val="yellow"/>
-              </w:rPr>
-              <w:t>[TBD]</w:t>
+              </w:rPr>
+              <w:t>0.511</w:t>
             </w:r>
           </w:p>
         </w:tc>
@@ -4411,7 +4398,7 @@
                 <w:b w:val="0"/>
                 <w:sz w:val="15"/>
               </w:rPr>
-              <w:t>0.785</w:t>
+              <w:t>0.809</w:t>
             </w:r>
           </w:p>
         </w:tc>
@@ -4437,7 +4424,7 @@
                 <w:b w:val="0"/>
                 <w:sz w:val="15"/>
               </w:rPr>
-              <w:t>0.645</w:t>
+              <w:t>0.680</w:t>
             </w:r>
           </w:p>
         </w:tc>
@@ -4488,9 +4475,8 @@
                 <w:rFonts w:ascii="Times New Roman" w:hAnsi="Times New Roman"/>
                 <w:b w:val="0"/>
                 <w:sz w:val="15"/>
-                <w:highlight w:val="yellow"/>
-              </w:rPr>
-              <w:t>[TBD]</w:t>
+              </w:rPr>
+              <w:t>0.613</w:t>
             </w:r>
           </w:p>
         </w:tc>
@@ -4512,27 +4498,41 @@
     </w:p>
     <w:p>
       <w:pPr>
-        <w:spacing w:after="80"/>
         <w:jc w:val="center"/>
       </w:pPr>
       <w:r>
-        <w:rPr>
-          <w:rFonts w:ascii="Times New Roman" w:hAnsi="Times New Roman"/>
-          <w:b w:val="0"/>
-          <w:i w:val="0"/>
-          <w:sz w:val="20"/>
-        </w:rPr>
-        <w:t xml:space="preserve">Figure pending: </w:t>
-      </w:r>
-      <w:r>
-        <w:rPr>
-          <w:rFonts w:ascii="Times New Roman" w:hAnsi="Times New Roman"/>
-          <w:b w:val="0"/>
-          <w:i w:val="0"/>
-          <w:sz w:val="20"/>
-          <w:highlight w:val="yellow"/>
-        </w:rPr>
-        <w:t>[TBD]</w:t>
+        <w:drawing>
+          <wp:inline>
+            <wp:extent cx="2926080" cy="2194560"/>
+            <wp:docPr id="1" name="Picture 1"/>
+            <wp:cNvGraphicFramePr>
+              <a:graphicFrameLocks noChangeAspect="1"/>
+            </wp:cNvGraphicFramePr>
+            <a:graphic>
+              <a:graphicData uri="http://schemas.openxmlformats.org/drawingml/2006/picture">
+                <pic:pic>
+                  <pic:nvPicPr>
+                    <pic:cNvPr id="0" name="confusion_matrix_normalized.png"/>
+                    <pic:cNvPicPr/>
+                  </pic:nvPicPr>
+                  <pic:blipFill>
+                    <a:blip r:embed="rId25"/>
+                    <a:stretch>
+                      <a:fillRect/>
+                    </a:stretch>
+                  </pic:blipFill>
+                  <pic:spPr>
+                    <a:xfrm>
+                      <a:off x="0" y="0"/>
+                      <a:ext cx="2926080" cy="2194560"/>
+                    </a:xfrm>
+                    <a:prstGeom prst="rect"/>
+                  </pic:spPr>
+                </pic:pic>
+              </a:graphicData>
+            </a:graphic>
+          </wp:inline>
+        </w:drawing>
       </w:r>
     </w:p>
     <w:p>
@@ -4579,9 +4579,8 @@
           <w:b w:val="0"/>
           <w:i w:val="0"/>
           <w:sz w:val="20"/>
-          <w:highlight w:val="yellow"/>
-        </w:rPr>
-        <w:t>[TBD]</w:t>
+        </w:rPr>
+        <w:t>71.8%</w:t>
       </w:r>
       <w:r>
         <w:rPr>
@@ -4598,9 +4597,8 @@
           <w:b w:val="0"/>
           <w:i w:val="0"/>
           <w:sz w:val="20"/>
-          <w:highlight w:val="yellow"/>
-        </w:rPr>
-        <w:t>[TBD]</w:t>
+        </w:rPr>
+        <w:t>59.7%</w:t>
       </w:r>
       <w:r>
         <w:rPr>
@@ -4617,9 +4615,8 @@
           <w:b w:val="0"/>
           <w:i w:val="0"/>
           <w:sz w:val="20"/>
-          <w:highlight w:val="yellow"/>
-        </w:rPr>
-        <w:t>[TBD]</w:t>
+        </w:rPr>
+        <w:t>61.3%</w:t>
       </w:r>
       <w:r>
         <w:rPr>
@@ -4636,28 +4633,17 @@
           <w:b w:val="0"/>
           <w:i w:val="0"/>
           <w:sz w:val="20"/>
-          <w:highlight w:val="yellow"/>
-        </w:rPr>
-        <w:t>[TBD]</w:t>
-      </w:r>
-      <w:r>
-        <w:rPr>
-          <w:rFonts w:ascii="Times New Roman" w:hAnsi="Times New Roman"/>
-          <w:b w:val="0"/>
-          <w:i w:val="0"/>
-          <w:sz w:val="20"/>
-        </w:rPr>
-        <w:t xml:space="preserve">. </w:t>
-      </w:r>
-      <w:r>
-        <w:rPr>
-          <w:rFonts w:ascii="Times New Roman" w:hAnsi="Times New Roman"/>
-          <w:b w:val="0"/>
-          <w:i w:val="0"/>
-          <w:sz w:val="20"/>
-          <w:highlight w:val="yellow"/>
-        </w:rPr>
-        <w:t>[TBD]</w:t>
+        </w:rPr>
+        <w:t>41.1%</w:t>
+      </w:r>
+      <w:r>
+        <w:rPr>
+          <w:rFonts w:ascii="Times New Roman" w:hAnsi="Times New Roman"/>
+          <w:b w:val="0"/>
+          <w:i w:val="0"/>
+          <w:sz w:val="20"/>
+        </w:rPr>
+        <w:t>. Test mAP50 is 7.5 points below validation. This is expected because the best checkpoint was chosen on validation. Almost the whole drop comes from bruise (0.777 to 0.594) while rot (0.761 to 0.732) and surface damage (0.527 to 0.511) stay close. The test split has only about 23 bruise instances so one missed bruise moves bruise recall by about four points. The test bruises may also differ in source or lighting from the training bruises. The test confusion matrix shows the same pattern as validation: most errors are missed defects while bruise and rot are rarely confused.</w:t>
       </w:r>
     </w:p>
     <w:p>
@@ -4724,7 +4710,7 @@
           <w:i w:val="0"/>
           <w:sz w:val="20"/>
         </w:rPr>
-        <w:t>Surface damage is the hardest class because it covers small scars, cuts and dry spots with weak contrast. Most errors are missed small defects, confusion between bruise and early rot, and false positives on natural speckles or glare. The images come from a few sources with mostly plain backgrounds. Performance on new lighting, cultivars or conveyor images is unknown. Classes describe appearance only and the model does not diagnose disease or internal damage.</w:t>
+        <w:t>Surface damage is the hardest class because it covers small scars, cuts and dry spots with weak contrast. The confusion matrices show that most errors are missed defects predicted as background. Bruise and rot are rarely confused with each other. On validation most false positives are surface damage predicted on marks the team did not label. The images come from a few sources with mostly plain backgrounds. Performance on new lighting, cultivars or conveyor images is unknown. Classes describe appearance only and the model does not diagnose disease or internal damage.</w:t>
       </w:r>
     </w:p>
     <w:p>
@@ -4798,18 +4784,17 @@
           <w:b w:val="0"/>
           <w:i w:val="0"/>
           <w:sz w:val="20"/>
-          <w:highlight w:val="yellow"/>
-        </w:rPr>
-        <w:t>[TBD]</w:t>
-      </w:r>
-      <w:r>
-        <w:rPr>
-          <w:rFonts w:ascii="Times New Roman" w:hAnsi="Times New Roman"/>
-          <w:b w:val="0"/>
-          <w:i w:val="0"/>
-          <w:sz w:val="20"/>
-        </w:rPr>
-        <w:t xml:space="preserve"> test mask mAP50. Rot was the easiest defect and surface damage the hardest. Future work should add more reviewed small-defect examples, run a controlled single-stage baseline with identical settings, test on images from new sources and measure agreement between annotators.</w:t>
+        </w:rPr>
+        <w:t>61.3%</w:t>
+      </w:r>
+      <w:r>
+        <w:rPr>
+          <w:rFonts w:ascii="Times New Roman" w:hAnsi="Times New Roman"/>
+          <w:b w:val="0"/>
+          <w:i w:val="0"/>
+          <w:sz w:val="20"/>
+        </w:rPr>
+        <w:t xml:space="preserve"> mask mAP50 on unseen test images. Rot was the most stable class and surface damage the hardest. Future work should add more reviewed small-defect examples, run a controlled single-stage baseline with identical settings, test on images from new sources and measure agreement between annotators.</w:t>
       </w:r>
     </w:p>
     <w:p>

</xml_diff>

<commit_message>
Add near-duplicate leakage check, IoU, failure cases and app screenshot
Co-Authored-By: Claude Opus 5.5 <noreply@anthropic.com>
</commit_message>
<xml_diff>
--- a/paper/CIPHER_AI2_IEEE_Paper.docx
+++ b/paper/CIPHER_AI2_IEEE_Paper.docx
@@ -885,7 +885,7 @@
           <w:i w:val="0"/>
           <w:sz w:val="18"/>
         </w:rPr>
-        <w:t xml:space="preserve"> mask mAP50. Tomato results are </w:t>
+        <w:t xml:space="preserve"> mask mAP50, or 50.4% after removing 20 test images that have a near-duplicate in training. Tomato results are </w:t>
       </w:r>
       <w:r>
         <w:rPr>
@@ -1755,7 +1755,7 @@
           <w:i w:val="0"/>
           <w:sz w:val="20"/>
         </w:rPr>
-        <w:t>The Roboflow training export contains up to three augmented variants of many photos. The 2,110 training files therefore come from 726 capture groups and not 2,110 distinct photos. Each group stays in one split. Validation has 215 images from 210 groups and test has 79 images from 75 groups. A further 63 images form a protected reserve that was not used at all. Exact pixel hashes and capture groups were checked for overlap across splits and none was found. 545 training images have no defect mask and act as negatives.</w:t>
+        <w:t>The Roboflow training export contains up to three augmented variants of many photos. The 2,110 training files therefore come from 726 capture groups and not 2,110 distinct photos. Each group stays in one split. Validation has 215 images from 210 groups and test has 79 images from 75 groups. A further 63 images form a protected reserve that was not used at all. Exact pixel hashes and capture groups were checked for overlap across splits and none was found. 545 training images have no defect mask and act as negatives. A later image-similarity check found that the Lab2Wild set stores repeated views of the same apple under different file names. Twenty test images and 64 validation images have a near-duplicate in training. Section V.C reports test results with and without them.</w:t>
       </w:r>
     </w:p>
     <w:p>
@@ -4648,14 +4648,6 @@
     </w:p>
     <w:p>
       <w:pPr>
-        <w:pStyle w:val="Heading2"/>
-      </w:pPr>
-      <w:r>
-        <w:t>D. Tomato</w:t>
-      </w:r>
-    </w:p>
-    <w:p>
-      <w:pPr>
         <w:spacing w:after="80"/>
         <w:ind w:firstLine="200"/>
         <w:jc w:val="both"/>
@@ -4667,34 +4659,503 @@
           <w:i w:val="0"/>
           <w:sz w:val="20"/>
         </w:rPr>
-        <w:t xml:space="preserve">Tomato follows the same two-stage recipe. </w:t>
-      </w:r>
+        <w:t>A difference-hash comparison then searched for training images within 20 of 256 bits of each test image. Twenty test images matched, 19 from Lab2Wild. Fig. 2 shows one pair: the same apple appears in both splits with a rotation. The model was evaluated again on the remaining 59 test images with no change to the model or settings (Table V). Mask mAP50 fell to 0.504. Bruise fell to 0.305 while rot (0.693) and surface damage (0.515) held. Most of the bruise test score therefore came from apples already seen in training. The 59-image figure is the better estimate for new photos. The same check flags 64 validation images, so validation scores and checkpoint selection are also optimistic.</w:t>
+      </w:r>
+    </w:p>
+    <w:p>
+      <w:pPr>
+        <w:spacing w:after="40"/>
+        <w:jc w:val="center"/>
+      </w:pPr>
+      <w:r>
+        <w:rPr>
+          <w:rFonts w:ascii="Times New Roman" w:hAnsi="Times New Roman"/>
+          <w:b w:val="0"/>
+          <w:i w:val="0"/>
+          <w:smallCaps/>
+          <w:sz w:val="16"/>
+        </w:rPr>
+        <w:t>TABLE V. TEST MASK mAP50 WITH AND WITHOUT NEAR-DUPLICATES</w:t>
+      </w:r>
+    </w:p>
+    <w:tbl>
+      <w:tblPr>
+        <w:tblW w:type="auto" w:w="0"/>
+        <w:jc w:val="center"/>
+        <w:tblLook w:firstColumn="1" w:firstRow="1" w:lastColumn="0" w:lastRow="0" w:noHBand="0" w:noVBand="1" w:val="04A0"/>
+      </w:tblPr>
+      <w:tblGrid>
+        <w:gridCol w:w="3364"/>
+        <w:gridCol w:w="3364"/>
+        <w:gridCol w:w="3364"/>
+      </w:tblGrid>
+      <w:tr>
+        <w:tc>
+          <w:tcPr>
+            <w:tcW w:type="dxa" w:w="1152"/>
+            <w:tcBorders>
+              <w:top w:val="single" w:sz="4" w:color="000000"/>
+              <w:left w:val="single" w:sz="4" w:color="000000"/>
+              <w:bottom w:val="single" w:sz="4" w:color="000000"/>
+              <w:right w:val="single" w:sz="4" w:color="000000"/>
+            </w:tcBorders>
+          </w:tcPr>
+          <w:p>
+            <w:pPr>
+              <w:spacing w:after="0"/>
+              <w:jc w:val="center"/>
+            </w:pPr>
+            <w:r/>
+            <w:r>
+              <w:rPr>
+                <w:rFonts w:ascii="Times New Roman" w:hAnsi="Times New Roman"/>
+                <w:b/>
+                <w:sz w:val="15"/>
+              </w:rPr>
+              <w:t>Class</w:t>
+            </w:r>
+          </w:p>
+        </w:tc>
+        <w:tc>
+          <w:tcPr>
+            <w:tcW w:type="dxa" w:w="1440"/>
+            <w:tcBorders>
+              <w:top w:val="single" w:sz="4" w:color="000000"/>
+              <w:left w:val="single" w:sz="4" w:color="000000"/>
+              <w:bottom w:val="single" w:sz="4" w:color="000000"/>
+              <w:right w:val="single" w:sz="4" w:color="000000"/>
+            </w:tcBorders>
+          </w:tcPr>
+          <w:p>
+            <w:pPr>
+              <w:spacing w:after="0"/>
+              <w:jc w:val="center"/>
+            </w:pPr>
+            <w:r/>
+            <w:r>
+              <w:rPr>
+                <w:rFonts w:ascii="Times New Roman" w:hAnsi="Times New Roman"/>
+                <w:b/>
+                <w:sz w:val="15"/>
+              </w:rPr>
+              <w:t>All 79 images</w:t>
+            </w:r>
+          </w:p>
+        </w:tc>
+        <w:tc>
+          <w:tcPr>
+            <w:tcW w:type="dxa" w:w="2016"/>
+            <w:tcBorders>
+              <w:top w:val="single" w:sz="4" w:color="000000"/>
+              <w:left w:val="single" w:sz="4" w:color="000000"/>
+              <w:bottom w:val="single" w:sz="4" w:color="000000"/>
+              <w:right w:val="single" w:sz="4" w:color="000000"/>
+            </w:tcBorders>
+          </w:tcPr>
+          <w:p>
+            <w:pPr>
+              <w:spacing w:after="0"/>
+              <w:jc w:val="center"/>
+            </w:pPr>
+            <w:r/>
+            <w:r>
+              <w:rPr>
+                <w:rFonts w:ascii="Times New Roman" w:hAnsi="Times New Roman"/>
+                <w:b/>
+                <w:sz w:val="15"/>
+              </w:rPr>
+              <w:t>59 images, no near-duplicate</w:t>
+            </w:r>
+          </w:p>
+        </w:tc>
+      </w:tr>
+      <w:tr>
+        <w:tc>
+          <w:tcPr>
+            <w:tcW w:type="dxa" w:w="1152"/>
+            <w:tcBorders>
+              <w:top w:val="single" w:sz="4" w:color="000000"/>
+              <w:left w:val="single" w:sz="4" w:color="000000"/>
+              <w:bottom w:val="single" w:sz="4" w:color="000000"/>
+              <w:right w:val="single" w:sz="4" w:color="000000"/>
+            </w:tcBorders>
+          </w:tcPr>
+          <w:p>
+            <w:pPr>
+              <w:spacing w:after="0"/>
+              <w:jc w:val="center"/>
+            </w:pPr>
+            <w:r/>
+            <w:r>
+              <w:rPr>
+                <w:rFonts w:ascii="Times New Roman" w:hAnsi="Times New Roman"/>
+                <w:b w:val="0"/>
+                <w:sz w:val="15"/>
+              </w:rPr>
+              <w:t>Bruise</w:t>
+            </w:r>
+          </w:p>
+        </w:tc>
+        <w:tc>
+          <w:tcPr>
+            <w:tcW w:type="dxa" w:w="1440"/>
+            <w:tcBorders>
+              <w:top w:val="single" w:sz="4" w:color="000000"/>
+              <w:left w:val="single" w:sz="4" w:color="000000"/>
+              <w:bottom w:val="single" w:sz="4" w:color="000000"/>
+              <w:right w:val="single" w:sz="4" w:color="000000"/>
+            </w:tcBorders>
+          </w:tcPr>
+          <w:p>
+            <w:pPr>
+              <w:spacing w:after="0"/>
+              <w:jc w:val="center"/>
+            </w:pPr>
+            <w:r/>
+            <w:r>
+              <w:rPr>
+                <w:rFonts w:ascii="Times New Roman" w:hAnsi="Times New Roman"/>
+                <w:b w:val="0"/>
+                <w:sz w:val="15"/>
+              </w:rPr>
+              <w:t>0.594</w:t>
+            </w:r>
+          </w:p>
+        </w:tc>
+        <w:tc>
+          <w:tcPr>
+            <w:tcW w:type="dxa" w:w="2016"/>
+            <w:tcBorders>
+              <w:top w:val="single" w:sz="4" w:color="000000"/>
+              <w:left w:val="single" w:sz="4" w:color="000000"/>
+              <w:bottom w:val="single" w:sz="4" w:color="000000"/>
+              <w:right w:val="single" w:sz="4" w:color="000000"/>
+            </w:tcBorders>
+          </w:tcPr>
+          <w:p>
+            <w:pPr>
+              <w:spacing w:after="0"/>
+              <w:jc w:val="center"/>
+            </w:pPr>
+            <w:r/>
+            <w:r>
+              <w:rPr>
+                <w:rFonts w:ascii="Times New Roman" w:hAnsi="Times New Roman"/>
+                <w:b w:val="0"/>
+                <w:sz w:val="15"/>
+              </w:rPr>
+              <w:t>0.305</w:t>
+            </w:r>
+          </w:p>
+        </w:tc>
+      </w:tr>
+      <w:tr>
+        <w:tc>
+          <w:tcPr>
+            <w:tcW w:type="dxa" w:w="1152"/>
+            <w:tcBorders>
+              <w:top w:val="single" w:sz="4" w:color="000000"/>
+              <w:left w:val="single" w:sz="4" w:color="000000"/>
+              <w:bottom w:val="single" w:sz="4" w:color="000000"/>
+              <w:right w:val="single" w:sz="4" w:color="000000"/>
+            </w:tcBorders>
+          </w:tcPr>
+          <w:p>
+            <w:pPr>
+              <w:spacing w:after="0"/>
+              <w:jc w:val="center"/>
+            </w:pPr>
+            <w:r/>
+            <w:r>
+              <w:rPr>
+                <w:rFonts w:ascii="Times New Roman" w:hAnsi="Times New Roman"/>
+                <w:b w:val="0"/>
+                <w:sz w:val="15"/>
+              </w:rPr>
+              <w:t>Rot</w:t>
+            </w:r>
+          </w:p>
+        </w:tc>
+        <w:tc>
+          <w:tcPr>
+            <w:tcW w:type="dxa" w:w="1440"/>
+            <w:tcBorders>
+              <w:top w:val="single" w:sz="4" w:color="000000"/>
+              <w:left w:val="single" w:sz="4" w:color="000000"/>
+              <w:bottom w:val="single" w:sz="4" w:color="000000"/>
+              <w:right w:val="single" w:sz="4" w:color="000000"/>
+            </w:tcBorders>
+          </w:tcPr>
+          <w:p>
+            <w:pPr>
+              <w:spacing w:after="0"/>
+              <w:jc w:val="center"/>
+            </w:pPr>
+            <w:r/>
+            <w:r>
+              <w:rPr>
+                <w:rFonts w:ascii="Times New Roman" w:hAnsi="Times New Roman"/>
+                <w:b w:val="0"/>
+                <w:sz w:val="15"/>
+              </w:rPr>
+              <w:t>0.732</w:t>
+            </w:r>
+          </w:p>
+        </w:tc>
+        <w:tc>
+          <w:tcPr>
+            <w:tcW w:type="dxa" w:w="2016"/>
+            <w:tcBorders>
+              <w:top w:val="single" w:sz="4" w:color="000000"/>
+              <w:left w:val="single" w:sz="4" w:color="000000"/>
+              <w:bottom w:val="single" w:sz="4" w:color="000000"/>
+              <w:right w:val="single" w:sz="4" w:color="000000"/>
+            </w:tcBorders>
+          </w:tcPr>
+          <w:p>
+            <w:pPr>
+              <w:spacing w:after="0"/>
+              <w:jc w:val="center"/>
+            </w:pPr>
+            <w:r/>
+            <w:r>
+              <w:rPr>
+                <w:rFonts w:ascii="Times New Roman" w:hAnsi="Times New Roman"/>
+                <w:b w:val="0"/>
+                <w:sz w:val="15"/>
+              </w:rPr>
+              <w:t>0.693</w:t>
+            </w:r>
+          </w:p>
+        </w:tc>
+      </w:tr>
+      <w:tr>
+        <w:tc>
+          <w:tcPr>
+            <w:tcW w:type="dxa" w:w="1152"/>
+            <w:tcBorders>
+              <w:top w:val="single" w:sz="4" w:color="000000"/>
+              <w:left w:val="single" w:sz="4" w:color="000000"/>
+              <w:bottom w:val="single" w:sz="4" w:color="000000"/>
+              <w:right w:val="single" w:sz="4" w:color="000000"/>
+            </w:tcBorders>
+          </w:tcPr>
+          <w:p>
+            <w:pPr>
+              <w:spacing w:after="0"/>
+              <w:jc w:val="center"/>
+            </w:pPr>
+            <w:r/>
+            <w:r>
+              <w:rPr>
+                <w:rFonts w:ascii="Times New Roman" w:hAnsi="Times New Roman"/>
+                <w:b w:val="0"/>
+                <w:sz w:val="15"/>
+              </w:rPr>
+              <w:t>Surface</w:t>
+            </w:r>
+          </w:p>
+        </w:tc>
+        <w:tc>
+          <w:tcPr>
+            <w:tcW w:type="dxa" w:w="1440"/>
+            <w:tcBorders>
+              <w:top w:val="single" w:sz="4" w:color="000000"/>
+              <w:left w:val="single" w:sz="4" w:color="000000"/>
+              <w:bottom w:val="single" w:sz="4" w:color="000000"/>
+              <w:right w:val="single" w:sz="4" w:color="000000"/>
+            </w:tcBorders>
+          </w:tcPr>
+          <w:p>
+            <w:pPr>
+              <w:spacing w:after="0"/>
+              <w:jc w:val="center"/>
+            </w:pPr>
+            <w:r/>
+            <w:r>
+              <w:rPr>
+                <w:rFonts w:ascii="Times New Roman" w:hAnsi="Times New Roman"/>
+                <w:b w:val="0"/>
+                <w:sz w:val="15"/>
+              </w:rPr>
+              <w:t>0.511</w:t>
+            </w:r>
+          </w:p>
+        </w:tc>
+        <w:tc>
+          <w:tcPr>
+            <w:tcW w:type="dxa" w:w="2016"/>
+            <w:tcBorders>
+              <w:top w:val="single" w:sz="4" w:color="000000"/>
+              <w:left w:val="single" w:sz="4" w:color="000000"/>
+              <w:bottom w:val="single" w:sz="4" w:color="000000"/>
+              <w:right w:val="single" w:sz="4" w:color="000000"/>
+            </w:tcBorders>
+          </w:tcPr>
+          <w:p>
+            <w:pPr>
+              <w:spacing w:after="0"/>
+              <w:jc w:val="center"/>
+            </w:pPr>
+            <w:r/>
+            <w:r>
+              <w:rPr>
+                <w:rFonts w:ascii="Times New Roman" w:hAnsi="Times New Roman"/>
+                <w:b w:val="0"/>
+                <w:sz w:val="15"/>
+              </w:rPr>
+              <w:t>0.515</w:t>
+            </w:r>
+          </w:p>
+        </w:tc>
+      </w:tr>
+      <w:tr>
+        <w:tc>
+          <w:tcPr>
+            <w:tcW w:type="dxa" w:w="1152"/>
+            <w:tcBorders>
+              <w:top w:val="single" w:sz="4" w:color="000000"/>
+              <w:left w:val="single" w:sz="4" w:color="000000"/>
+              <w:bottom w:val="single" w:sz="4" w:color="000000"/>
+              <w:right w:val="single" w:sz="4" w:color="000000"/>
+            </w:tcBorders>
+          </w:tcPr>
+          <w:p>
+            <w:pPr>
+              <w:spacing w:after="0"/>
+              <w:jc w:val="center"/>
+            </w:pPr>
+            <w:r/>
+            <w:r>
+              <w:rPr>
+                <w:rFonts w:ascii="Times New Roman" w:hAnsi="Times New Roman"/>
+                <w:b w:val="0"/>
+                <w:sz w:val="15"/>
+              </w:rPr>
+              <w:t>All</w:t>
+            </w:r>
+          </w:p>
+        </w:tc>
+        <w:tc>
+          <w:tcPr>
+            <w:tcW w:type="dxa" w:w="1440"/>
+            <w:tcBorders>
+              <w:top w:val="single" w:sz="4" w:color="000000"/>
+              <w:left w:val="single" w:sz="4" w:color="000000"/>
+              <w:bottom w:val="single" w:sz="4" w:color="000000"/>
+              <w:right w:val="single" w:sz="4" w:color="000000"/>
+            </w:tcBorders>
+          </w:tcPr>
+          <w:p>
+            <w:pPr>
+              <w:spacing w:after="0"/>
+              <w:jc w:val="center"/>
+            </w:pPr>
+            <w:r/>
+            <w:r>
+              <w:rPr>
+                <w:rFonts w:ascii="Times New Roman" w:hAnsi="Times New Roman"/>
+                <w:b w:val="0"/>
+                <w:sz w:val="15"/>
+              </w:rPr>
+              <w:t>0.613</w:t>
+            </w:r>
+          </w:p>
+        </w:tc>
+        <w:tc>
+          <w:tcPr>
+            <w:tcW w:type="dxa" w:w="2016"/>
+            <w:tcBorders>
+              <w:top w:val="single" w:sz="4" w:color="000000"/>
+              <w:left w:val="single" w:sz="4" w:color="000000"/>
+              <w:bottom w:val="single" w:sz="4" w:color="000000"/>
+              <w:right w:val="single" w:sz="4" w:color="000000"/>
+            </w:tcBorders>
+          </w:tcPr>
+          <w:p>
+            <w:pPr>
+              <w:spacing w:after="0"/>
+              <w:jc w:val="center"/>
+            </w:pPr>
+            <w:r/>
+            <w:r>
+              <w:rPr>
+                <w:rFonts w:ascii="Times New Roman" w:hAnsi="Times New Roman"/>
+                <w:b w:val="0"/>
+                <w:sz w:val="15"/>
+              </w:rPr>
+              <w:t>0.504</w:t>
+            </w:r>
+          </w:p>
+        </w:tc>
+      </w:tr>
+    </w:tbl>
+    <w:p>
+      <w:pPr>
+        <w:spacing w:after="40"/>
+        <w:jc w:val="both"/>
+      </w:pPr>
       <w:r>
         <w:rPr>
           <w:rFonts w:ascii="Times New Roman" w:hAnsi="Times New Roman"/>
           <w:b w:val="0"/>
           <w:i w:val="0"/>
           <w:sz w:val="20"/>
-          <w:highlight w:val="yellow"/>
-        </w:rPr>
-        <w:t>[TBD]</w:t>
-      </w:r>
-      <w:r>
-        <w:rPr>
-          <w:rFonts w:ascii="Times New Roman" w:hAnsi="Times New Roman"/>
-          <w:b w:val="0"/>
-          <w:i w:val="0"/>
-          <w:sz w:val="20"/>
-        </w:rPr>
-        <w:t xml:space="preserve"> An earlier joint apple and tomato model (Run 11) reached 0.955 mask mAP50 for the whole tomato but only 0.419, 0.597 and 0.347 for tomato bruise, rot and surface damage on validation. Tomato defects were the weakest part of the project.</w:t>
-      </w:r>
-    </w:p>
-    <w:p>
-      <w:pPr>
-        <w:pStyle w:val="Heading2"/>
-      </w:pPr>
-      <w:r>
-        <w:t>E. Errors and Limits</w:t>
+        </w:rPr>
+      </w:r>
+    </w:p>
+    <w:p>
+      <w:pPr>
+        <w:jc w:val="center"/>
+      </w:pPr>
+      <w:r>
+        <w:drawing>
+          <wp:inline>
+            <wp:extent cx="3017520" cy="620038"/>
+            <wp:docPr id="2" name="Picture 2"/>
+            <wp:cNvGraphicFramePr>
+              <a:graphicFrameLocks noChangeAspect="1"/>
+            </wp:cNvGraphicFramePr>
+            <a:graphic>
+              <a:graphicData uri="http://schemas.openxmlformats.org/drawingml/2006/picture">
+                <pic:pic>
+                  <pic:nvPicPr>
+                    <pic:cNvPr id="0" name="near_duplicate_example.png"/>
+                    <pic:cNvPicPr/>
+                  </pic:nvPicPr>
+                  <pic:blipFill>
+                    <a:blip r:embed="rId26"/>
+                    <a:stretch>
+                      <a:fillRect/>
+                    </a:stretch>
+                  </pic:blipFill>
+                  <pic:spPr>
+                    <a:xfrm>
+                      <a:off x="0" y="0"/>
+                      <a:ext cx="3017520" cy="620038"/>
+                    </a:xfrm>
+                    <a:prstGeom prst="rect"/>
+                  </pic:spPr>
+                </pic:pic>
+              </a:graphicData>
+            </a:graphic>
+          </wp:inline>
+        </w:drawing>
+      </w:r>
+    </w:p>
+    <w:p>
+      <w:pPr>
+        <w:spacing w:after="80"/>
+        <w:jc w:val="center"/>
+      </w:pPr>
+      <w:r>
+        <w:rPr>
+          <w:rFonts w:ascii="Times New Roman" w:hAnsi="Times New Roman"/>
+          <w:b w:val="0"/>
+          <w:i w:val="0"/>
+          <w:sz w:val="16"/>
+        </w:rPr>
+        <w:t>Fig. 2. Two test images (1st, 3rd) and their near-duplicates in training (2nd, 4th).</w:t>
       </w:r>
     </w:p>
     <w:p>
@@ -4710,7 +5171,7 @@
           <w:i w:val="0"/>
           <w:sz w:val="20"/>
         </w:rPr>
-        <w:t>Surface damage is the hardest class because it covers small scars, cuts and dry spots with weak contrast. The confusion matrices show that most errors are missed defects predicted as background. Bruise and rot are rarely confused with each other. On validation most false positives are surface damage predicted on marks the team did not label. The images come from a few sources with mostly plain backgrounds. Performance on new lighting, cultivars or conveyor images is unknown. Classes describe appearance only and the model does not diagnose disease or internal damage.</w:t>
+        <w:t>Across the 62 test images with a labeled defect, the mean per-image pixel IoU between predicted and labeled defect masks at confidence 0.25 was 0.583.</w:t>
       </w:r>
     </w:p>
     <w:p>
@@ -4718,7 +5179,7 @@
         <w:pStyle w:val="Heading2"/>
       </w:pPr>
       <w:r>
-        <w:t>F. Web Application</w:t>
+        <w:t>D. Tomato</w:t>
       </w:r>
     </w:p>
     <w:p>
@@ -4734,15 +5195,34 @@
           <w:i w:val="0"/>
           <w:sz w:val="20"/>
         </w:rPr>
-        <w:t>A Streamlit application loads the Stage 1 and Stage 2 checkpoints for the selected fruit. Users upload a photo or pick a sample. The app overlays colored defect masks with a legend and reports each defect class with its share of the image and of the Stage 1 fruit mask. A confidence slider, class toggles, inference time and a PNG download are included. Unreadable files and images with no defect produce clear messages.</w:t>
-      </w:r>
-    </w:p>
-    <w:p>
-      <w:pPr>
-        <w:pStyle w:val="Heading1"/>
-      </w:pPr>
-      <w:r>
-        <w:t>VI. CONCLUSION AND FUTURE WORK</w:t>
+        <w:t xml:space="preserve">Tomato follows the same two-stage recipe. </w:t>
+      </w:r>
+      <w:r>
+        <w:rPr>
+          <w:rFonts w:ascii="Times New Roman" w:hAnsi="Times New Roman"/>
+          <w:b w:val="0"/>
+          <w:i w:val="0"/>
+          <w:sz w:val="20"/>
+          <w:highlight w:val="yellow"/>
+        </w:rPr>
+        <w:t>[TBD]</w:t>
+      </w:r>
+      <w:r>
+        <w:rPr>
+          <w:rFonts w:ascii="Times New Roman" w:hAnsi="Times New Roman"/>
+          <w:b w:val="0"/>
+          <w:i w:val="0"/>
+          <w:sz w:val="20"/>
+        </w:rPr>
+        <w:t xml:space="preserve"> An earlier joint apple and tomato model (Run 11) reached 0.955 mask mAP50 for the whole tomato but only 0.419, 0.597 and 0.347 for tomato bruise, rot and surface damage on validation. Tomato defects were the weakest part of the project.</w:t>
+      </w:r>
+    </w:p>
+    <w:p>
+      <w:pPr>
+        <w:pStyle w:val="Heading2"/>
+      </w:pPr>
+      <w:r>
+        <w:t>E. Errors and Limits</w:t>
       </w:r>
     </w:p>
     <w:p>
@@ -4758,6 +5238,54 @@
           <w:i w:val="0"/>
           <w:sz w:val="20"/>
         </w:rPr>
+        <w:t>Surface damage is the hardest class because it covers small scars, cuts and dry spots with weak contrast. The confusion matrices show that most errors are missed defects predicted as background. Bruise and rot are rarely confused with each other. On validation most false positives are surface damage predicted on marks the team did not label. The images come from a few sources with mostly plain backgrounds. Performance on new lighting, cultivars or conveyor images is unknown. Capture groups did not catch repeated Lab2Wild views of the same apple, so some near-duplicates cross splits. A perceptual-hash grouping should be applied before the split in future work. Classes describe appearance only and the model does not diagnose disease or internal damage.</w:t>
+      </w:r>
+    </w:p>
+    <w:p>
+      <w:pPr>
+        <w:pStyle w:val="Heading2"/>
+      </w:pPr>
+      <w:r>
+        <w:t>F. Web Application</w:t>
+      </w:r>
+    </w:p>
+    <w:p>
+      <w:pPr>
+        <w:spacing w:after="80"/>
+        <w:ind w:firstLine="200"/>
+        <w:jc w:val="both"/>
+      </w:pPr>
+      <w:r>
+        <w:rPr>
+          <w:rFonts w:ascii="Times New Roman" w:hAnsi="Times New Roman"/>
+          <w:b w:val="0"/>
+          <w:i w:val="0"/>
+          <w:sz w:val="20"/>
+        </w:rPr>
+        <w:t>A Streamlit application loads the Stage 1 and Stage 2 checkpoints for the selected fruit. Users upload a photo or pick a sample. The app overlays colored defect masks with a legend and reports each defect class with its share of the image and of the Stage 1 fruit mask. A confidence slider, class toggles, inference time and a PNG download are included. Unreadable files and images with no defect produce clear messages.</w:t>
+      </w:r>
+    </w:p>
+    <w:p>
+      <w:pPr>
+        <w:pStyle w:val="Heading1"/>
+      </w:pPr>
+      <w:r>
+        <w:t>VI. CONCLUSION AND FUTURE WORK</w:t>
+      </w:r>
+    </w:p>
+    <w:p>
+      <w:pPr>
+        <w:spacing w:after="80"/>
+        <w:ind w:firstLine="200"/>
+        <w:jc w:val="both"/>
+      </w:pPr>
+      <w:r>
+        <w:rPr>
+          <w:rFonts w:ascii="Times New Roman" w:hAnsi="Times New Roman"/>
+          <w:b w:val="0"/>
+          <w:i w:val="0"/>
+          <w:sz w:val="20"/>
+        </w:rPr>
         <w:t xml:space="preserve">A two-stage YOLO26l model trained on team-reviewed masks segments the whole apple almost perfectly and segments three visible defect classes with </w:t>
       </w:r>
       <w:r>
@@ -4794,7 +5322,7 @@
           <w:i w:val="0"/>
           <w:sz w:val="20"/>
         </w:rPr>
-        <w:t xml:space="preserve"> mask mAP50 on unseen test images. Rot was the most stable class and surface damage the hardest. Future work should add more reviewed small-defect examples, run a controlled single-stage baseline with identical settings, test on images from new sources and measure agreement between annotators.</w:t>
+        <w:t xml:space="preserve"> mask mAP50 on the test split, or 50.4% on test images with no near-duplicate in training. Rot was the most stable class and surface damage the hardest. Future work should add more reviewed small-defect examples, regroup the data by perceptual hash before splitting, run a controlled single-stage baseline with identical settings, test on images from new sources and measure agreement between annotators.</w:t>
       </w:r>
     </w:p>
     <w:p>

</xml_diff>

<commit_message>
Add tomato and combined apple+tomato results, figures and app option
Runs 23 to 26 with their final tests, per-fruit test split for the combined
model, updated paper, slides, notebook, run chart and README.

Co-Authored-By: Claude Opus 5.5 <noreply@anthropic.com>
</commit_message>
<xml_diff>
--- a/paper/CIPHER_AI2_IEEE_Paper.docx
+++ b/paper/CIPHER_AI2_IEEE_Paper.docx
@@ -885,7 +885,7 @@
           <w:i w:val="0"/>
           <w:sz w:val="18"/>
         </w:rPr>
-        <w:t xml:space="preserve"> mask mAP50, or 50.4% after removing 20 test images that have a near-duplicate in training. Tomato results are </w:t>
+        <w:t xml:space="preserve"> mask mAP50, or 50.4% after removing 20 test images that have a near-duplicate in training. The tomato model reached </w:t>
       </w:r>
       <w:r>
         <w:rPr>
@@ -893,9 +893,8 @@
           <w:b/>
           <w:i w:val="0"/>
           <w:sz w:val="18"/>
-          <w:highlight w:val="yellow"/>
-        </w:rPr>
-        <w:t>[TBD]</w:t>
+        </w:rPr>
+        <w:t>39.3%</w:t>
       </w:r>
       <w:r>
         <w:rPr>
@@ -904,7 +903,43 @@
           <w:i w:val="0"/>
           <w:sz w:val="18"/>
         </w:rPr>
-        <w:t>. Rot was the most stable class and surface damage the hardest. A Streamlit application runs both stages on uploaded photos.</w:t>
+        <w:t xml:space="preserve"> test mask mAP50 with low recall. One combined model for both fruits reached </w:t>
+      </w:r>
+      <w:r>
+        <w:rPr>
+          <w:rFonts w:ascii="Times New Roman" w:hAnsi="Times New Roman"/>
+          <w:b/>
+          <w:i w:val="0"/>
+          <w:sz w:val="18"/>
+        </w:rPr>
+        <w:t>58.6%</w:t>
+      </w:r>
+      <w:r>
+        <w:rPr>
+          <w:rFonts w:ascii="Times New Roman" w:hAnsi="Times New Roman"/>
+          <w:b/>
+          <w:i w:val="0"/>
+          <w:sz w:val="18"/>
+        </w:rPr>
+        <w:t xml:space="preserve"> on the apple test images and </w:t>
+      </w:r>
+      <w:r>
+        <w:rPr>
+          <w:rFonts w:ascii="Times New Roman" w:hAnsi="Times New Roman"/>
+          <w:b/>
+          <w:i w:val="0"/>
+          <w:sz w:val="18"/>
+        </w:rPr>
+        <w:t>35.2%</w:t>
+      </w:r>
+      <w:r>
+        <w:rPr>
+          <w:rFonts w:ascii="Times New Roman" w:hAnsi="Times New Roman"/>
+          <w:b/>
+          <w:i w:val="0"/>
+          <w:sz w:val="18"/>
+        </w:rPr>
+        <w:t xml:space="preserve"> on the tomato test images, slightly below the separate models. Rot was the most stable class and surface damage the hardest. A Streamlit application runs both stages on uploaded photos.</w:t>
       </w:r>
     </w:p>
     <w:p>
@@ -1016,7 +1051,7 @@
           <w:i w:val="0"/>
           <w:sz w:val="20"/>
         </w:rPr>
-        <w:t>The contributions are: (1) a reviewed set of polygon masks for three visible defect classes built on top of image-level grading photos, (2) a frozen leakage-controlled split by capture group, (3) a record of 20 training runs from the first pilot to the final model, (4) a two-stage YOLO26l model evaluated on an untouched test split, and (5) an upload-and-predict web application.</w:t>
+        <w:t>The contributions are: (1) a reviewed set of polygon masks for three visible defect classes built on top of image-level grading photos, (2) a frozen leakage-controlled split by capture group, (3) a record of 24 training runs from the first pilot to the final model, (4) a two-stage YOLO26l model evaluated on an untouched test split, (5) a comparison of separate and combined models for apple and tomato, and (6) an upload-and-predict web application.</w:t>
       </w:r>
     </w:p>
     <w:p>
@@ -1240,7 +1275,7 @@
           <w:i w:val="0"/>
           <w:sz w:val="20"/>
         </w:rPr>
-        <w:t>Apple images come from three sources. AFruitDB grading photos [1] supply 986 training files. The Lab2Wild apple rot set by Nesteruk [9] supplies 843. Photos taken by the team supply 281. The original AFruitDB grade folders are image-level labels and were not used as training targets. All pixel masks were drawn by the team. Tomato images come from AFruitDB [1] and team captures. Tomato counts are reported in Section V.</w:t>
+        <w:t>Apple images come from three sources. AFruitDB grading photos [1] supply 986 training files. The Lab2Wild apple rot set by Nesteruk [9] supplies 843. Photos taken by the team supply 281. The original AFruitDB grade folders are image-level labels and were not used as training targets. All pixel masks were drawn by the team. Tomato images come from AFruitDB [1] and team captures. The tomato set has 1,313 training files from 459 capture groups, 132 validation images, 95 test images and a 39-image reserve.</w:t>
       </w:r>
     </w:p>
     <w:p>
@@ -2485,15 +2520,7 @@
           <w:i w:val="0"/>
           <w:sz w:val="20"/>
         </w:rPr>
-        <w:t>Online augmentation was applied to training images only: horizontal and vertical flips (p = 0.5), rotation up to 10 degrees, translation 0.05, scale 0.1 and small hue saturation and value shifts (0.01, 0.2, 0.2). Mosaic, MixUp and Copy-Paste were off so that defect color and texture stay realistic. Training ran on one NVIDIA A100 80 GB GPU in Google Colab with Ultralytics 8.4.126, mixed precision and seed 0.</w:t>
-      </w:r>
-    </w:p>
-    <w:p>
-      <w:pPr>
-        <w:pStyle w:val="Heading2"/>
-      </w:pPr>
-      <w:r>
-        <w:t>B. Evaluation Metrics</w:t>
+        <w:t>Tomato uses the same recipe: Run 23 for Stage 1 and Run 24 for Stage 2. The combined model uses the apple and tomato splits merged without reshuffling, so no image changes split. Its Stage 1 (Run 25) learns two classes, apple and tomato, with patience 5. Its Stage 2 (Run 26) starts from the Run 25 best checkpoint, keeps the same three shared defect names and was capped at 100 epochs because of compute. Fruit identity therefore comes from Stage 1 and defect type from Stage 2. Shared names were chosen over fruit-specific names such as apple_bruise because the classes describe appearance and splitting them would leave tomato with fewer examples per class.</w:t>
       </w:r>
     </w:p>
     <w:p>
@@ -2509,15 +2536,7 @@
           <w:i w:val="0"/>
           <w:sz w:val="20"/>
         </w:rPr>
-        <w:t>All scores are mask metrics. Precision is the share of predicted masks that match a labeled mask. Recall is the share of labeled masks that are found. A match needs an intersection over union (IoU) above a threshold, where IoU is the overlap area divided by the combined area. mAP50 is the mean average precision at IoU 0.50 and mAP50-95 averages it over IoU 0.50 to 0.95. The best checkpoint was chosen on validation only. The test split was evaluated once after every choice was frozen.</w:t>
-      </w:r>
-    </w:p>
-    <w:p>
-      <w:pPr>
-        <w:pStyle w:val="Heading1"/>
-      </w:pPr>
-      <w:r>
-        <w:t>V. RESULTS AND DISCUSSION</w:t>
+        <w:t>Online augmentation was applied to training images only: horizontal and vertical flips (p = 0.5), rotation up to 10 degrees, translation 0.05, scale 0.1 and small hue saturation and value shifts (0.01, 0.2, 0.2). Mosaic, MixUp and Copy-Paste were off so that defect color and texture stay realistic. Training ran on one NVIDIA A100 80 GB GPU in Google Colab with Ultralytics 8.4.126, mixed precision and seed 0.</w:t>
       </w:r>
     </w:p>
     <w:p>
@@ -2525,7 +2544,7 @@
         <w:pStyle w:val="Heading2"/>
       </w:pPr>
       <w:r>
-        <w:t>A. Run History</w:t>
+        <w:t>B. Evaluation Metrics</w:t>
       </w:r>
     </w:p>
     <w:p>
@@ -2541,7 +2560,39 @@
           <w:i w:val="0"/>
           <w:sz w:val="20"/>
         </w:rPr>
-        <w:t>Twenty runs were recorded from 13 September to 1 October 2026 (Table III). Early YOLO26n pilots on five classes stayed below 0.50 mask mAP50. Merging rare classes and adding more reviewed images raised scores. Joint apple and tomato models reached about 0.75 overall mAP50 but most of that came from the easy whole-fruit classes. Runs on different datasets are historical and not controlled comparisons.</w:t>
+        <w:t>All scores are mask metrics. Precision is the share of predicted masks that match a labeled mask. Recall is the share of labeled masks that are found. A match needs an intersection over union (IoU) above a threshold, where IoU is the overlap area divided by the combined area. mAP50 is the mean average precision at IoU 0.50 and mAP50-95 averages it over IoU 0.50 to 0.95. The best checkpoint was chosen on validation only. The test split was evaluated once after every choice was frozen.</w:t>
+      </w:r>
+    </w:p>
+    <w:p>
+      <w:pPr>
+        <w:pStyle w:val="Heading1"/>
+      </w:pPr>
+      <w:r>
+        <w:t>V. RESULTS AND DISCUSSION</w:t>
+      </w:r>
+    </w:p>
+    <w:p>
+      <w:pPr>
+        <w:pStyle w:val="Heading2"/>
+      </w:pPr>
+      <w:r>
+        <w:t>A. Run History</w:t>
+      </w:r>
+    </w:p>
+    <w:p>
+      <w:pPr>
+        <w:spacing w:after="80"/>
+        <w:ind w:firstLine="200"/>
+        <w:jc w:val="both"/>
+      </w:pPr>
+      <w:r>
+        <w:rPr>
+          <w:rFonts w:ascii="Times New Roman" w:hAnsi="Times New Roman"/>
+          <w:b w:val="0"/>
+          <w:i w:val="0"/>
+          <w:sz w:val="20"/>
+        </w:rPr>
+        <w:t>Twenty-four runs were recorded from 13 September to 1 October 2026 (Table III). Early YOLO26n pilots on five classes stayed below 0.50 mask mAP50. Merging rare classes and adding more reviewed images raised scores. Joint apple and tomato models reached about 0.75 overall mAP50 but most of that came from the easy whole-fruit classes. Runs on different datasets are historical and not controlled comparisons.</w:t>
       </w:r>
     </w:p>
     <w:p>
@@ -3625,6 +3676,270 @@
                 <w:sz w:val="15"/>
               </w:rPr>
               <w:t>0.457</w:t>
+            </w:r>
+          </w:p>
+        </w:tc>
+      </w:tr>
+      <w:tr>
+        <w:tc>
+          <w:tcPr>
+            <w:tcW w:type="dxa" w:w="1008"/>
+            <w:tcBorders>
+              <w:top w:val="single" w:sz="4" w:color="000000"/>
+              <w:left w:val="single" w:sz="4" w:color="000000"/>
+              <w:bottom w:val="single" w:sz="4" w:color="000000"/>
+              <w:right w:val="single" w:sz="4" w:color="000000"/>
+            </w:tcBorders>
+          </w:tcPr>
+          <w:p>
+            <w:pPr>
+              <w:spacing w:after="0"/>
+              <w:jc w:val="center"/>
+            </w:pPr>
+            <w:r/>
+            <w:r>
+              <w:rPr>
+                <w:rFonts w:ascii="Times New Roman" w:hAnsi="Times New Roman"/>
+                <w:b w:val="0"/>
+                <w:sz w:val="15"/>
+              </w:rPr>
+              <w:t>Run 24 S2</w:t>
+            </w:r>
+          </w:p>
+        </w:tc>
+        <w:tc>
+          <w:tcPr>
+            <w:tcW w:type="dxa" w:w="1296"/>
+            <w:tcBorders>
+              <w:top w:val="single" w:sz="4" w:color="000000"/>
+              <w:left w:val="single" w:sz="4" w:color="000000"/>
+              <w:bottom w:val="single" w:sz="4" w:color="000000"/>
+              <w:right w:val="single" w:sz="4" w:color="000000"/>
+            </w:tcBorders>
+          </w:tcPr>
+          <w:p>
+            <w:pPr>
+              <w:spacing w:after="0"/>
+              <w:jc w:val="center"/>
+            </w:pPr>
+            <w:r/>
+            <w:r>
+              <w:rPr>
+                <w:rFonts w:ascii="Times New Roman" w:hAnsi="Times New Roman"/>
+                <w:b w:val="0"/>
+                <w:sz w:val="15"/>
+              </w:rPr>
+              <w:t>Tomato defects</w:t>
+            </w:r>
+          </w:p>
+        </w:tc>
+        <w:tc>
+          <w:tcPr>
+            <w:tcW w:type="dxa" w:w="576"/>
+            <w:tcBorders>
+              <w:top w:val="single" w:sz="4" w:color="000000"/>
+              <w:left w:val="single" w:sz="4" w:color="000000"/>
+              <w:bottom w:val="single" w:sz="4" w:color="000000"/>
+              <w:right w:val="single" w:sz="4" w:color="000000"/>
+            </w:tcBorders>
+          </w:tcPr>
+          <w:p>
+            <w:pPr>
+              <w:spacing w:after="0"/>
+              <w:jc w:val="center"/>
+            </w:pPr>
+            <w:r/>
+            <w:r>
+              <w:rPr>
+                <w:rFonts w:ascii="Times New Roman" w:hAnsi="Times New Roman"/>
+                <w:b w:val="0"/>
+                <w:sz w:val="15"/>
+              </w:rPr>
+              <w:t>26l</w:t>
+            </w:r>
+          </w:p>
+        </w:tc>
+        <w:tc>
+          <w:tcPr>
+            <w:tcW w:type="dxa" w:w="720"/>
+            <w:tcBorders>
+              <w:top w:val="single" w:sz="4" w:color="000000"/>
+              <w:left w:val="single" w:sz="4" w:color="000000"/>
+              <w:bottom w:val="single" w:sz="4" w:color="000000"/>
+              <w:right w:val="single" w:sz="4" w:color="000000"/>
+            </w:tcBorders>
+          </w:tcPr>
+          <w:p>
+            <w:pPr>
+              <w:spacing w:after="0"/>
+              <w:jc w:val="center"/>
+            </w:pPr>
+            <w:r/>
+            <w:r>
+              <w:rPr>
+                <w:rFonts w:ascii="Times New Roman" w:hAnsi="Times New Roman"/>
+                <w:b w:val="0"/>
+                <w:sz w:val="15"/>
+              </w:rPr>
+              <w:t>0.494</w:t>
+            </w:r>
+          </w:p>
+        </w:tc>
+        <w:tc>
+          <w:tcPr>
+            <w:tcW w:type="dxa" w:w="864"/>
+            <w:tcBorders>
+              <w:top w:val="single" w:sz="4" w:color="000000"/>
+              <w:left w:val="single" w:sz="4" w:color="000000"/>
+              <w:bottom w:val="single" w:sz="4" w:color="000000"/>
+              <w:right w:val="single" w:sz="4" w:color="000000"/>
+            </w:tcBorders>
+          </w:tcPr>
+          <w:p>
+            <w:pPr>
+              <w:spacing w:after="0"/>
+              <w:jc w:val="center"/>
+            </w:pPr>
+            <w:r/>
+            <w:r>
+              <w:rPr>
+                <w:rFonts w:ascii="Times New Roman" w:hAnsi="Times New Roman"/>
+                <w:b w:val="0"/>
+                <w:sz w:val="15"/>
+              </w:rPr>
+              <w:t>0.295</w:t>
+            </w:r>
+          </w:p>
+        </w:tc>
+      </w:tr>
+      <w:tr>
+        <w:tc>
+          <w:tcPr>
+            <w:tcW w:type="dxa" w:w="1008"/>
+            <w:tcBorders>
+              <w:top w:val="single" w:sz="4" w:color="000000"/>
+              <w:left w:val="single" w:sz="4" w:color="000000"/>
+              <w:bottom w:val="single" w:sz="4" w:color="000000"/>
+              <w:right w:val="single" w:sz="4" w:color="000000"/>
+            </w:tcBorders>
+          </w:tcPr>
+          <w:p>
+            <w:pPr>
+              <w:spacing w:after="0"/>
+              <w:jc w:val="center"/>
+            </w:pPr>
+            <w:r/>
+            <w:r>
+              <w:rPr>
+                <w:rFonts w:ascii="Times New Roman" w:hAnsi="Times New Roman"/>
+                <w:b w:val="0"/>
+                <w:sz w:val="15"/>
+              </w:rPr>
+              <w:t>Run 26 S2</w:t>
+            </w:r>
+          </w:p>
+        </w:tc>
+        <w:tc>
+          <w:tcPr>
+            <w:tcW w:type="dxa" w:w="1296"/>
+            <w:tcBorders>
+              <w:top w:val="single" w:sz="4" w:color="000000"/>
+              <w:left w:val="single" w:sz="4" w:color="000000"/>
+              <w:bottom w:val="single" w:sz="4" w:color="000000"/>
+              <w:right w:val="single" w:sz="4" w:color="000000"/>
+            </w:tcBorders>
+          </w:tcPr>
+          <w:p>
+            <w:pPr>
+              <w:spacing w:after="0"/>
+              <w:jc w:val="center"/>
+            </w:pPr>
+            <w:r/>
+            <w:r>
+              <w:rPr>
+                <w:rFonts w:ascii="Times New Roman" w:hAnsi="Times New Roman"/>
+                <w:b w:val="0"/>
+                <w:sz w:val="15"/>
+              </w:rPr>
+              <w:t>Both, defects</w:t>
+            </w:r>
+          </w:p>
+        </w:tc>
+        <w:tc>
+          <w:tcPr>
+            <w:tcW w:type="dxa" w:w="576"/>
+            <w:tcBorders>
+              <w:top w:val="single" w:sz="4" w:color="000000"/>
+              <w:left w:val="single" w:sz="4" w:color="000000"/>
+              <w:bottom w:val="single" w:sz="4" w:color="000000"/>
+              <w:right w:val="single" w:sz="4" w:color="000000"/>
+            </w:tcBorders>
+          </w:tcPr>
+          <w:p>
+            <w:pPr>
+              <w:spacing w:after="0"/>
+              <w:jc w:val="center"/>
+            </w:pPr>
+            <w:r/>
+            <w:r>
+              <w:rPr>
+                <w:rFonts w:ascii="Times New Roman" w:hAnsi="Times New Roman"/>
+                <w:b w:val="0"/>
+                <w:sz w:val="15"/>
+              </w:rPr>
+              <w:t>26l</w:t>
+            </w:r>
+          </w:p>
+        </w:tc>
+        <w:tc>
+          <w:tcPr>
+            <w:tcW w:type="dxa" w:w="720"/>
+            <w:tcBorders>
+              <w:top w:val="single" w:sz="4" w:color="000000"/>
+              <w:left w:val="single" w:sz="4" w:color="000000"/>
+              <w:bottom w:val="single" w:sz="4" w:color="000000"/>
+              <w:right w:val="single" w:sz="4" w:color="000000"/>
+            </w:tcBorders>
+          </w:tcPr>
+          <w:p>
+            <w:pPr>
+              <w:spacing w:after="0"/>
+              <w:jc w:val="center"/>
+            </w:pPr>
+            <w:r/>
+            <w:r>
+              <w:rPr>
+                <w:rFonts w:ascii="Times New Roman" w:hAnsi="Times New Roman"/>
+                <w:b w:val="0"/>
+                <w:sz w:val="15"/>
+              </w:rPr>
+              <w:t>0.600</w:t>
+            </w:r>
+          </w:p>
+        </w:tc>
+        <w:tc>
+          <w:tcPr>
+            <w:tcW w:type="dxa" w:w="864"/>
+            <w:tcBorders>
+              <w:top w:val="single" w:sz="4" w:color="000000"/>
+              <w:left w:val="single" w:sz="4" w:color="000000"/>
+              <w:bottom w:val="single" w:sz="4" w:color="000000"/>
+              <w:right w:val="single" w:sz="4" w:color="000000"/>
+            </w:tcBorders>
+          </w:tcPr>
+          <w:p>
+            <w:pPr>
+              <w:spacing w:after="0"/>
+              <w:jc w:val="center"/>
+            </w:pPr>
+            <w:r/>
+            <w:r>
+              <w:rPr>
+                <w:rFonts w:ascii="Times New Roman" w:hAnsi="Times New Roman"/>
+                <w:b w:val="0"/>
+                <w:sz w:val="15"/>
+              </w:rPr>
+              <w:t>0.374</w:t>
             </w:r>
           </w:p>
         </w:tc>
@@ -5195,26 +5510,801 @@
           <w:i w:val="0"/>
           <w:sz w:val="20"/>
         </w:rPr>
-        <w:t xml:space="preserve">Tomato follows the same two-stage recipe. </w:t>
-      </w:r>
-      <w:r>
-        <w:rPr>
-          <w:rFonts w:ascii="Times New Roman" w:hAnsi="Times New Roman"/>
-          <w:b w:val="0"/>
-          <w:i w:val="0"/>
-          <w:sz w:val="20"/>
-          <w:highlight w:val="yellow"/>
-        </w:rPr>
-        <w:t>[TBD]</w:t>
-      </w:r>
-      <w:r>
-        <w:rPr>
-          <w:rFonts w:ascii="Times New Roman" w:hAnsi="Times New Roman"/>
-          <w:b w:val="0"/>
-          <w:i w:val="0"/>
-          <w:sz w:val="20"/>
-        </w:rPr>
-        <w:t xml:space="preserve"> An earlier joint apple and tomato model (Run 11) reached 0.955 mask mAP50 for the whole tomato but only 0.419, 0.597 and 0.347 for tomato bruise, rot and surface damage on validation. Tomato defects were the weakest part of the project.</w:t>
+        <w:t xml:space="preserve">Stage 1 segments the whole tomato with </w:t>
+      </w:r>
+      <w:r>
+        <w:rPr>
+          <w:rFonts w:ascii="Times New Roman" w:hAnsi="Times New Roman"/>
+          <w:b w:val="0"/>
+          <w:i w:val="0"/>
+          <w:sz w:val="20"/>
+        </w:rPr>
+        <w:t>96.6%</w:t>
+      </w:r>
+      <w:r>
+        <w:rPr>
+          <w:rFonts w:ascii="Times New Roman" w:hAnsi="Times New Roman"/>
+          <w:b w:val="0"/>
+          <w:i w:val="0"/>
+          <w:sz w:val="20"/>
+        </w:rPr>
+        <w:t xml:space="preserve"> validation mask mAP50. Stage 2 reached </w:t>
+      </w:r>
+      <w:r>
+        <w:rPr>
+          <w:rFonts w:ascii="Times New Roman" w:hAnsi="Times New Roman"/>
+          <w:b w:val="0"/>
+          <w:i w:val="0"/>
+          <w:sz w:val="20"/>
+        </w:rPr>
+        <w:t>49.4%</w:t>
+      </w:r>
+      <w:r>
+        <w:rPr>
+          <w:rFonts w:ascii="Times New Roman" w:hAnsi="Times New Roman"/>
+          <w:b w:val="0"/>
+          <w:i w:val="0"/>
+          <w:sz w:val="20"/>
+        </w:rPr>
+        <w:t xml:space="preserve"> validation mask mAP50 and </w:t>
+      </w:r>
+      <w:r>
+        <w:rPr>
+          <w:rFonts w:ascii="Times New Roman" w:hAnsi="Times New Roman"/>
+          <w:b w:val="0"/>
+          <w:i w:val="0"/>
+          <w:sz w:val="20"/>
+        </w:rPr>
+        <w:t>39.3%</w:t>
+      </w:r>
+      <w:r>
+        <w:rPr>
+          <w:rFonts w:ascii="Times New Roman" w:hAnsi="Times New Roman"/>
+          <w:b w:val="0"/>
+          <w:i w:val="0"/>
+          <w:sz w:val="20"/>
+        </w:rPr>
+        <w:t xml:space="preserve"> on the 95 test images. Test precision was </w:t>
+      </w:r>
+      <w:r>
+        <w:rPr>
+          <w:rFonts w:ascii="Times New Roman" w:hAnsi="Times New Roman"/>
+          <w:b w:val="0"/>
+          <w:i w:val="0"/>
+          <w:sz w:val="20"/>
+        </w:rPr>
+        <w:t>73.2%</w:t>
+      </w:r>
+      <w:r>
+        <w:rPr>
+          <w:rFonts w:ascii="Times New Roman" w:hAnsi="Times New Roman"/>
+          <w:b w:val="0"/>
+          <w:i w:val="0"/>
+          <w:sz w:val="20"/>
+        </w:rPr>
+        <w:t xml:space="preserve"> but recall only </w:t>
+      </w:r>
+      <w:r>
+        <w:rPr>
+          <w:rFonts w:ascii="Times New Roman" w:hAnsi="Times New Roman"/>
+          <w:b w:val="0"/>
+          <w:i w:val="0"/>
+          <w:sz w:val="20"/>
+        </w:rPr>
+        <w:t>37.5%</w:t>
+      </w:r>
+      <w:r>
+        <w:rPr>
+          <w:rFonts w:ascii="Times New Roman" w:hAnsi="Times New Roman"/>
+          <w:b w:val="0"/>
+          <w:i w:val="0"/>
+          <w:sz w:val="20"/>
+        </w:rPr>
+        <w:t>. When the model marks a tomato defect it is usually right but it misses most of them. Table VI gives per-class results. Tomato has fewer training files than apple (1,313 against 2,110) from fewer capture groups (459 against 726). An earlier joint model (Run 11) also found tomato defects the weakest part of the project. The near-duplicate check used for apple has not yet been run on the tomato splits, so the tomato test score may also be optimistic.</w:t>
+      </w:r>
+    </w:p>
+    <w:p>
+      <w:pPr>
+        <w:spacing w:after="40"/>
+        <w:jc w:val="center"/>
+      </w:pPr>
+      <w:r>
+        <w:rPr>
+          <w:rFonts w:ascii="Times New Roman" w:hAnsi="Times New Roman"/>
+          <w:b w:val="0"/>
+          <w:i w:val="0"/>
+          <w:smallCaps/>
+          <w:sz w:val="16"/>
+        </w:rPr>
+        <w:t>TABLE VI. TOMATO STAGE 2 PER-CLASS MASK RESULTS</w:t>
+      </w:r>
+    </w:p>
+    <w:tbl>
+      <w:tblPr>
+        <w:tblW w:type="auto" w:w="0"/>
+        <w:jc w:val="center"/>
+        <w:tblLook w:firstColumn="1" w:firstRow="1" w:lastColumn="0" w:lastRow="0" w:noHBand="0" w:noVBand="1" w:val="04A0"/>
+      </w:tblPr>
+      <w:tblGrid>
+        <w:gridCol w:w="2018"/>
+        <w:gridCol w:w="2018"/>
+        <w:gridCol w:w="2018"/>
+        <w:gridCol w:w="2018"/>
+        <w:gridCol w:w="2018"/>
+      </w:tblGrid>
+      <w:tr>
+        <w:tc>
+          <w:tcPr>
+            <w:tcW w:type="dxa" w:w="1008"/>
+            <w:tcBorders>
+              <w:top w:val="single" w:sz="4" w:color="000000"/>
+              <w:left w:val="single" w:sz="4" w:color="000000"/>
+              <w:bottom w:val="single" w:sz="4" w:color="000000"/>
+              <w:right w:val="single" w:sz="4" w:color="000000"/>
+            </w:tcBorders>
+          </w:tcPr>
+          <w:p>
+            <w:pPr>
+              <w:spacing w:after="0"/>
+              <w:jc w:val="center"/>
+            </w:pPr>
+            <w:r/>
+            <w:r>
+              <w:rPr>
+                <w:rFonts w:ascii="Times New Roman" w:hAnsi="Times New Roman"/>
+                <w:b/>
+                <w:sz w:val="15"/>
+              </w:rPr>
+              <w:t>Class</w:t>
+            </w:r>
+          </w:p>
+        </w:tc>
+        <w:tc>
+          <w:tcPr>
+            <w:tcW w:type="dxa" w:w="864"/>
+            <w:tcBorders>
+              <w:top w:val="single" w:sz="4" w:color="000000"/>
+              <w:left w:val="single" w:sz="4" w:color="000000"/>
+              <w:bottom w:val="single" w:sz="4" w:color="000000"/>
+              <w:right w:val="single" w:sz="4" w:color="000000"/>
+            </w:tcBorders>
+          </w:tcPr>
+          <w:p>
+            <w:pPr>
+              <w:spacing w:after="0"/>
+              <w:jc w:val="center"/>
+            </w:pPr>
+            <w:r/>
+            <w:r>
+              <w:rPr>
+                <w:rFonts w:ascii="Times New Roman" w:hAnsi="Times New Roman"/>
+                <w:b/>
+                <w:sz w:val="15"/>
+              </w:rPr>
+              <w:t>Val mAP50</w:t>
+            </w:r>
+          </w:p>
+        </w:tc>
+        <w:tc>
+          <w:tcPr>
+            <w:tcW w:type="dxa" w:w="720"/>
+            <w:tcBorders>
+              <w:top w:val="single" w:sz="4" w:color="000000"/>
+              <w:left w:val="single" w:sz="4" w:color="000000"/>
+              <w:bottom w:val="single" w:sz="4" w:color="000000"/>
+              <w:right w:val="single" w:sz="4" w:color="000000"/>
+            </w:tcBorders>
+          </w:tcPr>
+          <w:p>
+            <w:pPr>
+              <w:spacing w:after="0"/>
+              <w:jc w:val="center"/>
+            </w:pPr>
+            <w:r/>
+            <w:r>
+              <w:rPr>
+                <w:rFonts w:ascii="Times New Roman" w:hAnsi="Times New Roman"/>
+                <w:b/>
+                <w:sz w:val="15"/>
+              </w:rPr>
+              <w:t>Test P</w:t>
+            </w:r>
+          </w:p>
+        </w:tc>
+        <w:tc>
+          <w:tcPr>
+            <w:tcW w:type="dxa" w:w="720"/>
+            <w:tcBorders>
+              <w:top w:val="single" w:sz="4" w:color="000000"/>
+              <w:left w:val="single" w:sz="4" w:color="000000"/>
+              <w:bottom w:val="single" w:sz="4" w:color="000000"/>
+              <w:right w:val="single" w:sz="4" w:color="000000"/>
+            </w:tcBorders>
+          </w:tcPr>
+          <w:p>
+            <w:pPr>
+              <w:spacing w:after="0"/>
+              <w:jc w:val="center"/>
+            </w:pPr>
+            <w:r/>
+            <w:r>
+              <w:rPr>
+                <w:rFonts w:ascii="Times New Roman" w:hAnsi="Times New Roman"/>
+                <w:b/>
+                <w:sz w:val="15"/>
+              </w:rPr>
+              <w:t>Test R</w:t>
+            </w:r>
+          </w:p>
+        </w:tc>
+        <w:tc>
+          <w:tcPr>
+            <w:tcW w:type="dxa" w:w="864"/>
+            <w:tcBorders>
+              <w:top w:val="single" w:sz="4" w:color="000000"/>
+              <w:left w:val="single" w:sz="4" w:color="000000"/>
+              <w:bottom w:val="single" w:sz="4" w:color="000000"/>
+              <w:right w:val="single" w:sz="4" w:color="000000"/>
+            </w:tcBorders>
+          </w:tcPr>
+          <w:p>
+            <w:pPr>
+              <w:spacing w:after="0"/>
+              <w:jc w:val="center"/>
+            </w:pPr>
+            <w:r/>
+            <w:r>
+              <w:rPr>
+                <w:rFonts w:ascii="Times New Roman" w:hAnsi="Times New Roman"/>
+                <w:b/>
+                <w:sz w:val="15"/>
+              </w:rPr>
+              <w:t>Test mAP50</w:t>
+            </w:r>
+          </w:p>
+        </w:tc>
+      </w:tr>
+      <w:tr>
+        <w:tc>
+          <w:tcPr>
+            <w:tcW w:type="dxa" w:w="1008"/>
+            <w:tcBorders>
+              <w:top w:val="single" w:sz="4" w:color="000000"/>
+              <w:left w:val="single" w:sz="4" w:color="000000"/>
+              <w:bottom w:val="single" w:sz="4" w:color="000000"/>
+              <w:right w:val="single" w:sz="4" w:color="000000"/>
+            </w:tcBorders>
+          </w:tcPr>
+          <w:p>
+            <w:pPr>
+              <w:spacing w:after="0"/>
+              <w:jc w:val="center"/>
+            </w:pPr>
+            <w:r/>
+            <w:r>
+              <w:rPr>
+                <w:rFonts w:ascii="Times New Roman" w:hAnsi="Times New Roman"/>
+                <w:b w:val="0"/>
+                <w:sz w:val="15"/>
+              </w:rPr>
+              <w:t>Bruise</w:t>
+            </w:r>
+          </w:p>
+        </w:tc>
+        <w:tc>
+          <w:tcPr>
+            <w:tcW w:type="dxa" w:w="864"/>
+            <w:tcBorders>
+              <w:top w:val="single" w:sz="4" w:color="000000"/>
+              <w:left w:val="single" w:sz="4" w:color="000000"/>
+              <w:bottom w:val="single" w:sz="4" w:color="000000"/>
+              <w:right w:val="single" w:sz="4" w:color="000000"/>
+            </w:tcBorders>
+          </w:tcPr>
+          <w:p>
+            <w:pPr>
+              <w:spacing w:after="0"/>
+              <w:jc w:val="center"/>
+            </w:pPr>
+            <w:r/>
+            <w:r>
+              <w:rPr>
+                <w:rFonts w:ascii="Times New Roman" w:hAnsi="Times New Roman"/>
+                <w:b w:val="0"/>
+                <w:sz w:val="15"/>
+              </w:rPr>
+              <w:t>0.468</w:t>
+            </w:r>
+          </w:p>
+        </w:tc>
+        <w:tc>
+          <w:tcPr>
+            <w:tcW w:type="dxa" w:w="720"/>
+            <w:tcBorders>
+              <w:top w:val="single" w:sz="4" w:color="000000"/>
+              <w:left w:val="single" w:sz="4" w:color="000000"/>
+              <w:bottom w:val="single" w:sz="4" w:color="000000"/>
+              <w:right w:val="single" w:sz="4" w:color="000000"/>
+            </w:tcBorders>
+          </w:tcPr>
+          <w:p>
+            <w:pPr>
+              <w:spacing w:after="0"/>
+              <w:jc w:val="center"/>
+            </w:pPr>
+            <w:r/>
+            <w:r>
+              <w:rPr>
+                <w:rFonts w:ascii="Times New Roman" w:hAnsi="Times New Roman"/>
+                <w:b w:val="0"/>
+                <w:sz w:val="15"/>
+              </w:rPr>
+              <w:t>0.794</w:t>
+            </w:r>
+          </w:p>
+        </w:tc>
+        <w:tc>
+          <w:tcPr>
+            <w:tcW w:type="dxa" w:w="720"/>
+            <w:tcBorders>
+              <w:top w:val="single" w:sz="4" w:color="000000"/>
+              <w:left w:val="single" w:sz="4" w:color="000000"/>
+              <w:bottom w:val="single" w:sz="4" w:color="000000"/>
+              <w:right w:val="single" w:sz="4" w:color="000000"/>
+            </w:tcBorders>
+          </w:tcPr>
+          <w:p>
+            <w:pPr>
+              <w:spacing w:after="0"/>
+              <w:jc w:val="center"/>
+            </w:pPr>
+            <w:r/>
+            <w:r>
+              <w:rPr>
+                <w:rFonts w:ascii="Times New Roman" w:hAnsi="Times New Roman"/>
+                <w:b w:val="0"/>
+                <w:sz w:val="15"/>
+              </w:rPr>
+              <w:t>0.387</w:t>
+            </w:r>
+          </w:p>
+        </w:tc>
+        <w:tc>
+          <w:tcPr>
+            <w:tcW w:type="dxa" w:w="864"/>
+            <w:tcBorders>
+              <w:top w:val="single" w:sz="4" w:color="000000"/>
+              <w:left w:val="single" w:sz="4" w:color="000000"/>
+              <w:bottom w:val="single" w:sz="4" w:color="000000"/>
+              <w:right w:val="single" w:sz="4" w:color="000000"/>
+            </w:tcBorders>
+          </w:tcPr>
+          <w:p>
+            <w:pPr>
+              <w:spacing w:after="0"/>
+              <w:jc w:val="center"/>
+            </w:pPr>
+            <w:r/>
+            <w:r>
+              <w:rPr>
+                <w:rFonts w:ascii="Times New Roman" w:hAnsi="Times New Roman"/>
+                <w:b w:val="0"/>
+                <w:sz w:val="15"/>
+              </w:rPr>
+              <w:t>0.388</w:t>
+            </w:r>
+          </w:p>
+        </w:tc>
+      </w:tr>
+      <w:tr>
+        <w:tc>
+          <w:tcPr>
+            <w:tcW w:type="dxa" w:w="1008"/>
+            <w:tcBorders>
+              <w:top w:val="single" w:sz="4" w:color="000000"/>
+              <w:left w:val="single" w:sz="4" w:color="000000"/>
+              <w:bottom w:val="single" w:sz="4" w:color="000000"/>
+              <w:right w:val="single" w:sz="4" w:color="000000"/>
+            </w:tcBorders>
+          </w:tcPr>
+          <w:p>
+            <w:pPr>
+              <w:spacing w:after="0"/>
+              <w:jc w:val="center"/>
+            </w:pPr>
+            <w:r/>
+            <w:r>
+              <w:rPr>
+                <w:rFonts w:ascii="Times New Roman" w:hAnsi="Times New Roman"/>
+                <w:b w:val="0"/>
+                <w:sz w:val="15"/>
+              </w:rPr>
+              <w:t>Rot</w:t>
+            </w:r>
+          </w:p>
+        </w:tc>
+        <w:tc>
+          <w:tcPr>
+            <w:tcW w:type="dxa" w:w="864"/>
+            <w:tcBorders>
+              <w:top w:val="single" w:sz="4" w:color="000000"/>
+              <w:left w:val="single" w:sz="4" w:color="000000"/>
+              <w:bottom w:val="single" w:sz="4" w:color="000000"/>
+              <w:right w:val="single" w:sz="4" w:color="000000"/>
+            </w:tcBorders>
+          </w:tcPr>
+          <w:p>
+            <w:pPr>
+              <w:spacing w:after="0"/>
+              <w:jc w:val="center"/>
+            </w:pPr>
+            <w:r/>
+            <w:r>
+              <w:rPr>
+                <w:rFonts w:ascii="Times New Roman" w:hAnsi="Times New Roman"/>
+                <w:b w:val="0"/>
+                <w:sz w:val="15"/>
+              </w:rPr>
+              <w:t>0.533</w:t>
+            </w:r>
+          </w:p>
+        </w:tc>
+        <w:tc>
+          <w:tcPr>
+            <w:tcW w:type="dxa" w:w="720"/>
+            <w:tcBorders>
+              <w:top w:val="single" w:sz="4" w:color="000000"/>
+              <w:left w:val="single" w:sz="4" w:color="000000"/>
+              <w:bottom w:val="single" w:sz="4" w:color="000000"/>
+              <w:right w:val="single" w:sz="4" w:color="000000"/>
+            </w:tcBorders>
+          </w:tcPr>
+          <w:p>
+            <w:pPr>
+              <w:spacing w:after="0"/>
+              <w:jc w:val="center"/>
+            </w:pPr>
+            <w:r/>
+            <w:r>
+              <w:rPr>
+                <w:rFonts w:ascii="Times New Roman" w:hAnsi="Times New Roman"/>
+                <w:b w:val="0"/>
+                <w:sz w:val="15"/>
+              </w:rPr>
+              <w:t>0.848</w:t>
+            </w:r>
+          </w:p>
+        </w:tc>
+        <w:tc>
+          <w:tcPr>
+            <w:tcW w:type="dxa" w:w="720"/>
+            <w:tcBorders>
+              <w:top w:val="single" w:sz="4" w:color="000000"/>
+              <w:left w:val="single" w:sz="4" w:color="000000"/>
+              <w:bottom w:val="single" w:sz="4" w:color="000000"/>
+              <w:right w:val="single" w:sz="4" w:color="000000"/>
+            </w:tcBorders>
+          </w:tcPr>
+          <w:p>
+            <w:pPr>
+              <w:spacing w:after="0"/>
+              <w:jc w:val="center"/>
+            </w:pPr>
+            <w:r/>
+            <w:r>
+              <w:rPr>
+                <w:rFonts w:ascii="Times New Roman" w:hAnsi="Times New Roman"/>
+                <w:b w:val="0"/>
+                <w:sz w:val="15"/>
+              </w:rPr>
+              <w:t>0.382</w:t>
+            </w:r>
+          </w:p>
+        </w:tc>
+        <w:tc>
+          <w:tcPr>
+            <w:tcW w:type="dxa" w:w="864"/>
+            <w:tcBorders>
+              <w:top w:val="single" w:sz="4" w:color="000000"/>
+              <w:left w:val="single" w:sz="4" w:color="000000"/>
+              <w:bottom w:val="single" w:sz="4" w:color="000000"/>
+              <w:right w:val="single" w:sz="4" w:color="000000"/>
+            </w:tcBorders>
+          </w:tcPr>
+          <w:p>
+            <w:pPr>
+              <w:spacing w:after="0"/>
+              <w:jc w:val="center"/>
+            </w:pPr>
+            <w:r/>
+            <w:r>
+              <w:rPr>
+                <w:rFonts w:ascii="Times New Roman" w:hAnsi="Times New Roman"/>
+                <w:b w:val="0"/>
+                <w:sz w:val="15"/>
+              </w:rPr>
+              <w:t>0.477</w:t>
+            </w:r>
+          </w:p>
+        </w:tc>
+      </w:tr>
+      <w:tr>
+        <w:tc>
+          <w:tcPr>
+            <w:tcW w:type="dxa" w:w="1008"/>
+            <w:tcBorders>
+              <w:top w:val="single" w:sz="4" w:color="000000"/>
+              <w:left w:val="single" w:sz="4" w:color="000000"/>
+              <w:bottom w:val="single" w:sz="4" w:color="000000"/>
+              <w:right w:val="single" w:sz="4" w:color="000000"/>
+            </w:tcBorders>
+          </w:tcPr>
+          <w:p>
+            <w:pPr>
+              <w:spacing w:after="0"/>
+              <w:jc w:val="center"/>
+            </w:pPr>
+            <w:r/>
+            <w:r>
+              <w:rPr>
+                <w:rFonts w:ascii="Times New Roman" w:hAnsi="Times New Roman"/>
+                <w:b w:val="0"/>
+                <w:sz w:val="15"/>
+              </w:rPr>
+              <w:t>Surface</w:t>
+            </w:r>
+          </w:p>
+        </w:tc>
+        <w:tc>
+          <w:tcPr>
+            <w:tcW w:type="dxa" w:w="864"/>
+            <w:tcBorders>
+              <w:top w:val="single" w:sz="4" w:color="000000"/>
+              <w:left w:val="single" w:sz="4" w:color="000000"/>
+              <w:bottom w:val="single" w:sz="4" w:color="000000"/>
+              <w:right w:val="single" w:sz="4" w:color="000000"/>
+            </w:tcBorders>
+          </w:tcPr>
+          <w:p>
+            <w:pPr>
+              <w:spacing w:after="0"/>
+              <w:jc w:val="center"/>
+            </w:pPr>
+            <w:r/>
+            <w:r>
+              <w:rPr>
+                <w:rFonts w:ascii="Times New Roman" w:hAnsi="Times New Roman"/>
+                <w:b w:val="0"/>
+                <w:sz w:val="15"/>
+              </w:rPr>
+              <w:t>0.482</w:t>
+            </w:r>
+          </w:p>
+        </w:tc>
+        <w:tc>
+          <w:tcPr>
+            <w:tcW w:type="dxa" w:w="720"/>
+            <w:tcBorders>
+              <w:top w:val="single" w:sz="4" w:color="000000"/>
+              <w:left w:val="single" w:sz="4" w:color="000000"/>
+              <w:bottom w:val="single" w:sz="4" w:color="000000"/>
+              <w:right w:val="single" w:sz="4" w:color="000000"/>
+            </w:tcBorders>
+          </w:tcPr>
+          <w:p>
+            <w:pPr>
+              <w:spacing w:after="0"/>
+              <w:jc w:val="center"/>
+            </w:pPr>
+            <w:r/>
+            <w:r>
+              <w:rPr>
+                <w:rFonts w:ascii="Times New Roman" w:hAnsi="Times New Roman"/>
+                <w:b w:val="0"/>
+                <w:sz w:val="15"/>
+              </w:rPr>
+              <w:t>0.555</w:t>
+            </w:r>
+          </w:p>
+        </w:tc>
+        <w:tc>
+          <w:tcPr>
+            <w:tcW w:type="dxa" w:w="720"/>
+            <w:tcBorders>
+              <w:top w:val="single" w:sz="4" w:color="000000"/>
+              <w:left w:val="single" w:sz="4" w:color="000000"/>
+              <w:bottom w:val="single" w:sz="4" w:color="000000"/>
+              <w:right w:val="single" w:sz="4" w:color="000000"/>
+            </w:tcBorders>
+          </w:tcPr>
+          <w:p>
+            <w:pPr>
+              <w:spacing w:after="0"/>
+              <w:jc w:val="center"/>
+            </w:pPr>
+            <w:r/>
+            <w:r>
+              <w:rPr>
+                <w:rFonts w:ascii="Times New Roman" w:hAnsi="Times New Roman"/>
+                <w:b w:val="0"/>
+                <w:sz w:val="15"/>
+              </w:rPr>
+              <w:t>0.357</w:t>
+            </w:r>
+          </w:p>
+        </w:tc>
+        <w:tc>
+          <w:tcPr>
+            <w:tcW w:type="dxa" w:w="864"/>
+            <w:tcBorders>
+              <w:top w:val="single" w:sz="4" w:color="000000"/>
+              <w:left w:val="single" w:sz="4" w:color="000000"/>
+              <w:bottom w:val="single" w:sz="4" w:color="000000"/>
+              <w:right w:val="single" w:sz="4" w:color="000000"/>
+            </w:tcBorders>
+          </w:tcPr>
+          <w:p>
+            <w:pPr>
+              <w:spacing w:after="0"/>
+              <w:jc w:val="center"/>
+            </w:pPr>
+            <w:r/>
+            <w:r>
+              <w:rPr>
+                <w:rFonts w:ascii="Times New Roman" w:hAnsi="Times New Roman"/>
+                <w:b w:val="0"/>
+                <w:sz w:val="15"/>
+              </w:rPr>
+              <w:t>0.314</w:t>
+            </w:r>
+          </w:p>
+        </w:tc>
+      </w:tr>
+      <w:tr>
+        <w:tc>
+          <w:tcPr>
+            <w:tcW w:type="dxa" w:w="1008"/>
+            <w:tcBorders>
+              <w:top w:val="single" w:sz="4" w:color="000000"/>
+              <w:left w:val="single" w:sz="4" w:color="000000"/>
+              <w:bottom w:val="single" w:sz="4" w:color="000000"/>
+              <w:right w:val="single" w:sz="4" w:color="000000"/>
+            </w:tcBorders>
+          </w:tcPr>
+          <w:p>
+            <w:pPr>
+              <w:spacing w:after="0"/>
+              <w:jc w:val="center"/>
+            </w:pPr>
+            <w:r/>
+            <w:r>
+              <w:rPr>
+                <w:rFonts w:ascii="Times New Roman" w:hAnsi="Times New Roman"/>
+                <w:b w:val="0"/>
+                <w:sz w:val="15"/>
+              </w:rPr>
+              <w:t>All</w:t>
+            </w:r>
+          </w:p>
+        </w:tc>
+        <w:tc>
+          <w:tcPr>
+            <w:tcW w:type="dxa" w:w="864"/>
+            <w:tcBorders>
+              <w:top w:val="single" w:sz="4" w:color="000000"/>
+              <w:left w:val="single" w:sz="4" w:color="000000"/>
+              <w:bottom w:val="single" w:sz="4" w:color="000000"/>
+              <w:right w:val="single" w:sz="4" w:color="000000"/>
+            </w:tcBorders>
+          </w:tcPr>
+          <w:p>
+            <w:pPr>
+              <w:spacing w:after="0"/>
+              <w:jc w:val="center"/>
+            </w:pPr>
+            <w:r/>
+            <w:r>
+              <w:rPr>
+                <w:rFonts w:ascii="Times New Roman" w:hAnsi="Times New Roman"/>
+                <w:b w:val="0"/>
+                <w:sz w:val="15"/>
+              </w:rPr>
+              <w:t>0.494</w:t>
+            </w:r>
+          </w:p>
+        </w:tc>
+        <w:tc>
+          <w:tcPr>
+            <w:tcW w:type="dxa" w:w="720"/>
+            <w:tcBorders>
+              <w:top w:val="single" w:sz="4" w:color="000000"/>
+              <w:left w:val="single" w:sz="4" w:color="000000"/>
+              <w:bottom w:val="single" w:sz="4" w:color="000000"/>
+              <w:right w:val="single" w:sz="4" w:color="000000"/>
+            </w:tcBorders>
+          </w:tcPr>
+          <w:p>
+            <w:pPr>
+              <w:spacing w:after="0"/>
+              <w:jc w:val="center"/>
+            </w:pPr>
+            <w:r/>
+            <w:r>
+              <w:rPr>
+                <w:rFonts w:ascii="Times New Roman" w:hAnsi="Times New Roman"/>
+                <w:b w:val="0"/>
+                <w:sz w:val="15"/>
+              </w:rPr>
+              <w:t>0.732</w:t>
+            </w:r>
+          </w:p>
+        </w:tc>
+        <w:tc>
+          <w:tcPr>
+            <w:tcW w:type="dxa" w:w="720"/>
+            <w:tcBorders>
+              <w:top w:val="single" w:sz="4" w:color="000000"/>
+              <w:left w:val="single" w:sz="4" w:color="000000"/>
+              <w:bottom w:val="single" w:sz="4" w:color="000000"/>
+              <w:right w:val="single" w:sz="4" w:color="000000"/>
+            </w:tcBorders>
+          </w:tcPr>
+          <w:p>
+            <w:pPr>
+              <w:spacing w:after="0"/>
+              <w:jc w:val="center"/>
+            </w:pPr>
+            <w:r/>
+            <w:r>
+              <w:rPr>
+                <w:rFonts w:ascii="Times New Roman" w:hAnsi="Times New Roman"/>
+                <w:b w:val="0"/>
+                <w:sz w:val="15"/>
+              </w:rPr>
+              <w:t>0.375</w:t>
+            </w:r>
+          </w:p>
+        </w:tc>
+        <w:tc>
+          <w:tcPr>
+            <w:tcW w:type="dxa" w:w="864"/>
+            <w:tcBorders>
+              <w:top w:val="single" w:sz="4" w:color="000000"/>
+              <w:left w:val="single" w:sz="4" w:color="000000"/>
+              <w:bottom w:val="single" w:sz="4" w:color="000000"/>
+              <w:right w:val="single" w:sz="4" w:color="000000"/>
+            </w:tcBorders>
+          </w:tcPr>
+          <w:p>
+            <w:pPr>
+              <w:spacing w:after="0"/>
+              <w:jc w:val="center"/>
+            </w:pPr>
+            <w:r/>
+            <w:r>
+              <w:rPr>
+                <w:rFonts w:ascii="Times New Roman" w:hAnsi="Times New Roman"/>
+                <w:b w:val="0"/>
+                <w:sz w:val="15"/>
+              </w:rPr>
+              <w:t>0.393</w:t>
+            </w:r>
+          </w:p>
+        </w:tc>
+      </w:tr>
+    </w:tbl>
+    <w:p>
+      <w:pPr>
+        <w:spacing w:after="40"/>
+        <w:jc w:val="both"/>
+      </w:pPr>
+      <w:r>
+        <w:rPr>
+          <w:rFonts w:ascii="Times New Roman" w:hAnsi="Times New Roman"/>
+          <w:b w:val="0"/>
+          <w:i w:val="0"/>
+          <w:sz w:val="20"/>
+        </w:rPr>
       </w:r>
     </w:p>
     <w:p>
@@ -5222,7 +6312,7 @@
         <w:pStyle w:val="Heading2"/>
       </w:pPr>
       <w:r>
-        <w:t>E. Errors and Limits</w:t>
+        <w:t>E. One Model for Both Fruits</w:t>
       </w:r>
     </w:p>
     <w:p>
@@ -5238,7 +6328,819 @@
           <w:i w:val="0"/>
           <w:sz w:val="20"/>
         </w:rPr>
-        <w:t>Surface damage is the hardest class because it covers small scars, cuts and dry spots with weak contrast. The confusion matrices show that most errors are missed defects predicted as background. Bruise and rot are rarely confused with each other. On validation most false positives are surface damage predicted on marks the team did not label. The images come from a few sources with mostly plain backgrounds. Performance on new lighting, cultivars or conveyor images is unknown. Capture groups did not catch repeated Lab2Wild views of the same apple, so some near-duplicates cross splits. A perceptual-hash grouping should be applied before the split in future work. Classes describe appearance only and the model does not diagnose disease or internal damage.</w:t>
+        <w:t xml:space="preserve">The combined Stage 1 model separates the two fruits well, with </w:t>
+      </w:r>
+      <w:r>
+        <w:rPr>
+          <w:rFonts w:ascii="Times New Roman" w:hAnsi="Times New Roman"/>
+          <w:b w:val="0"/>
+          <w:i w:val="0"/>
+          <w:sz w:val="20"/>
+        </w:rPr>
+        <w:t>98.5%</w:t>
+      </w:r>
+      <w:r>
+        <w:rPr>
+          <w:rFonts w:ascii="Times New Roman" w:hAnsi="Times New Roman"/>
+          <w:b w:val="0"/>
+          <w:i w:val="0"/>
+          <w:sz w:val="20"/>
+        </w:rPr>
+        <w:t xml:space="preserve"> mask mAP50 for apple and </w:t>
+      </w:r>
+      <w:r>
+        <w:rPr>
+          <w:rFonts w:ascii="Times New Roman" w:hAnsi="Times New Roman"/>
+          <w:b w:val="0"/>
+          <w:i w:val="0"/>
+          <w:sz w:val="20"/>
+        </w:rPr>
+        <w:t>94.9%</w:t>
+      </w:r>
+      <w:r>
+        <w:rPr>
+          <w:rFonts w:ascii="Times New Roman" w:hAnsi="Times New Roman"/>
+          <w:b w:val="0"/>
+          <w:i w:val="0"/>
+          <w:sz w:val="20"/>
+        </w:rPr>
+        <w:t xml:space="preserve"> for tomato on validation. On validation the combined Stage 2 model was level with the separate models. On the test split it was slightly lower for both fruits (Table VII): </w:t>
+      </w:r>
+      <w:r>
+        <w:rPr>
+          <w:rFonts w:ascii="Times New Roman" w:hAnsi="Times New Roman"/>
+          <w:b w:val="0"/>
+          <w:i w:val="0"/>
+          <w:sz w:val="20"/>
+        </w:rPr>
+        <w:t>58.6%</w:t>
+      </w:r>
+      <w:r>
+        <w:rPr>
+          <w:rFonts w:ascii="Times New Roman" w:hAnsi="Times New Roman"/>
+          <w:b w:val="0"/>
+          <w:i w:val="0"/>
+          <w:sz w:val="20"/>
+        </w:rPr>
+        <w:t xml:space="preserve"> against </w:t>
+      </w:r>
+      <w:r>
+        <w:rPr>
+          <w:rFonts w:ascii="Times New Roman" w:hAnsi="Times New Roman"/>
+          <w:b w:val="0"/>
+          <w:i w:val="0"/>
+          <w:sz w:val="20"/>
+        </w:rPr>
+        <w:t>61.3%</w:t>
+      </w:r>
+      <w:r>
+        <w:rPr>
+          <w:rFonts w:ascii="Times New Roman" w:hAnsi="Times New Roman"/>
+          <w:b w:val="0"/>
+          <w:i w:val="0"/>
+          <w:sz w:val="20"/>
+        </w:rPr>
+        <w:t xml:space="preserve"> for apple and </w:t>
+      </w:r>
+      <w:r>
+        <w:rPr>
+          <w:rFonts w:ascii="Times New Roman" w:hAnsi="Times New Roman"/>
+          <w:b w:val="0"/>
+          <w:i w:val="0"/>
+          <w:sz w:val="20"/>
+        </w:rPr>
+        <w:t>35.2%</w:t>
+      </w:r>
+      <w:r>
+        <w:rPr>
+          <w:rFonts w:ascii="Times New Roman" w:hAnsi="Times New Roman"/>
+          <w:b w:val="0"/>
+          <w:i w:val="0"/>
+          <w:sz w:val="20"/>
+        </w:rPr>
+        <w:t xml:space="preserve"> against </w:t>
+      </w:r>
+      <w:r>
+        <w:rPr>
+          <w:rFonts w:ascii="Times New Roman" w:hAnsi="Times New Roman"/>
+          <w:b w:val="0"/>
+          <w:i w:val="0"/>
+          <w:sz w:val="20"/>
+        </w:rPr>
+        <w:t>39.3%</w:t>
+      </w:r>
+      <w:r>
+        <w:rPr>
+          <w:rFonts w:ascii="Times New Roman" w:hAnsi="Times New Roman"/>
+          <w:b w:val="0"/>
+          <w:i w:val="0"/>
+          <w:sz w:val="20"/>
+        </w:rPr>
+        <w:t xml:space="preserve"> for tomato. Some classes moved in opposite directions. Apple rot rose from 0.732 to 0.849 while apple bruise fell from 0.594 to 0.411. Each class has only 18 to 28 test images, so gaps of three to four points are within the noise of a single split. The result does not show that combining fruits helps. It does show that one model can serve both fruits at a small cost.</w:t>
+      </w:r>
+    </w:p>
+    <w:p>
+      <w:pPr>
+        <w:spacing w:after="40"/>
+        <w:jc w:val="center"/>
+      </w:pPr>
+      <w:r>
+        <w:rPr>
+          <w:rFonts w:ascii="Times New Roman" w:hAnsi="Times New Roman"/>
+          <w:b w:val="0"/>
+          <w:i w:val="0"/>
+          <w:smallCaps/>
+          <w:sz w:val="16"/>
+        </w:rPr>
+        <w:t>TABLE VII. TEST MASK mAP50: SEPARATE (SEP) VS COMBINED (COMB) MODELS</w:t>
+      </w:r>
+    </w:p>
+    <w:tbl>
+      <w:tblPr>
+        <w:tblW w:type="auto" w:w="0"/>
+        <w:jc w:val="center"/>
+        <w:tblLook w:firstColumn="1" w:firstRow="1" w:lastColumn="0" w:lastRow="0" w:noHBand="0" w:noVBand="1" w:val="04A0"/>
+      </w:tblPr>
+      <w:tblGrid>
+        <w:gridCol w:w="2018"/>
+        <w:gridCol w:w="2018"/>
+        <w:gridCol w:w="2018"/>
+        <w:gridCol w:w="2018"/>
+        <w:gridCol w:w="2018"/>
+      </w:tblGrid>
+      <w:tr>
+        <w:tc>
+          <w:tcPr>
+            <w:tcW w:type="dxa" w:w="864"/>
+            <w:tcBorders>
+              <w:top w:val="single" w:sz="4" w:color="000000"/>
+              <w:left w:val="single" w:sz="4" w:color="000000"/>
+              <w:bottom w:val="single" w:sz="4" w:color="000000"/>
+              <w:right w:val="single" w:sz="4" w:color="000000"/>
+            </w:tcBorders>
+          </w:tcPr>
+          <w:p>
+            <w:pPr>
+              <w:spacing w:after="0"/>
+              <w:jc w:val="center"/>
+            </w:pPr>
+            <w:r/>
+            <w:r>
+              <w:rPr>
+                <w:rFonts w:ascii="Times New Roman" w:hAnsi="Times New Roman"/>
+                <w:b/>
+                <w:sz w:val="15"/>
+              </w:rPr>
+              <w:t>Class</w:t>
+            </w:r>
+          </w:p>
+        </w:tc>
+        <w:tc>
+          <w:tcPr>
+            <w:tcW w:type="dxa" w:w="864"/>
+            <w:tcBorders>
+              <w:top w:val="single" w:sz="4" w:color="000000"/>
+              <w:left w:val="single" w:sz="4" w:color="000000"/>
+              <w:bottom w:val="single" w:sz="4" w:color="000000"/>
+              <w:right w:val="single" w:sz="4" w:color="000000"/>
+            </w:tcBorders>
+          </w:tcPr>
+          <w:p>
+            <w:pPr>
+              <w:spacing w:after="0"/>
+              <w:jc w:val="center"/>
+            </w:pPr>
+            <w:r/>
+            <w:r>
+              <w:rPr>
+                <w:rFonts w:ascii="Times New Roman" w:hAnsi="Times New Roman"/>
+                <w:b/>
+                <w:sz w:val="15"/>
+              </w:rPr>
+              <w:t>Apple sep</w:t>
+            </w:r>
+          </w:p>
+        </w:tc>
+        <w:tc>
+          <w:tcPr>
+            <w:tcW w:type="dxa" w:w="936"/>
+            <w:tcBorders>
+              <w:top w:val="single" w:sz="4" w:color="000000"/>
+              <w:left w:val="single" w:sz="4" w:color="000000"/>
+              <w:bottom w:val="single" w:sz="4" w:color="000000"/>
+              <w:right w:val="single" w:sz="4" w:color="000000"/>
+            </w:tcBorders>
+          </w:tcPr>
+          <w:p>
+            <w:pPr>
+              <w:spacing w:after="0"/>
+              <w:jc w:val="center"/>
+            </w:pPr>
+            <w:r/>
+            <w:r>
+              <w:rPr>
+                <w:rFonts w:ascii="Times New Roman" w:hAnsi="Times New Roman"/>
+                <w:b/>
+                <w:sz w:val="15"/>
+              </w:rPr>
+              <w:t>Apple comb</w:t>
+            </w:r>
+          </w:p>
+        </w:tc>
+        <w:tc>
+          <w:tcPr>
+            <w:tcW w:type="dxa" w:w="936"/>
+            <w:tcBorders>
+              <w:top w:val="single" w:sz="4" w:color="000000"/>
+              <w:left w:val="single" w:sz="4" w:color="000000"/>
+              <w:bottom w:val="single" w:sz="4" w:color="000000"/>
+              <w:right w:val="single" w:sz="4" w:color="000000"/>
+            </w:tcBorders>
+          </w:tcPr>
+          <w:p>
+            <w:pPr>
+              <w:spacing w:after="0"/>
+              <w:jc w:val="center"/>
+            </w:pPr>
+            <w:r/>
+            <w:r>
+              <w:rPr>
+                <w:rFonts w:ascii="Times New Roman" w:hAnsi="Times New Roman"/>
+                <w:b/>
+                <w:sz w:val="15"/>
+              </w:rPr>
+              <w:t>Tomato sep</w:t>
+            </w:r>
+          </w:p>
+        </w:tc>
+        <w:tc>
+          <w:tcPr>
+            <w:tcW w:type="dxa" w:w="1008"/>
+            <w:tcBorders>
+              <w:top w:val="single" w:sz="4" w:color="000000"/>
+              <w:left w:val="single" w:sz="4" w:color="000000"/>
+              <w:bottom w:val="single" w:sz="4" w:color="000000"/>
+              <w:right w:val="single" w:sz="4" w:color="000000"/>
+            </w:tcBorders>
+          </w:tcPr>
+          <w:p>
+            <w:pPr>
+              <w:spacing w:after="0"/>
+              <w:jc w:val="center"/>
+            </w:pPr>
+            <w:r/>
+            <w:r>
+              <w:rPr>
+                <w:rFonts w:ascii="Times New Roman" w:hAnsi="Times New Roman"/>
+                <w:b/>
+                <w:sz w:val="15"/>
+              </w:rPr>
+              <w:t>Tomato comb</w:t>
+            </w:r>
+          </w:p>
+        </w:tc>
+      </w:tr>
+      <w:tr>
+        <w:tc>
+          <w:tcPr>
+            <w:tcW w:type="dxa" w:w="864"/>
+            <w:tcBorders>
+              <w:top w:val="single" w:sz="4" w:color="000000"/>
+              <w:left w:val="single" w:sz="4" w:color="000000"/>
+              <w:bottom w:val="single" w:sz="4" w:color="000000"/>
+              <w:right w:val="single" w:sz="4" w:color="000000"/>
+            </w:tcBorders>
+          </w:tcPr>
+          <w:p>
+            <w:pPr>
+              <w:spacing w:after="0"/>
+              <w:jc w:val="center"/>
+            </w:pPr>
+            <w:r/>
+            <w:r>
+              <w:rPr>
+                <w:rFonts w:ascii="Times New Roman" w:hAnsi="Times New Roman"/>
+                <w:b w:val="0"/>
+                <w:sz w:val="15"/>
+              </w:rPr>
+              <w:t>Bruise</w:t>
+            </w:r>
+          </w:p>
+        </w:tc>
+        <w:tc>
+          <w:tcPr>
+            <w:tcW w:type="dxa" w:w="864"/>
+            <w:tcBorders>
+              <w:top w:val="single" w:sz="4" w:color="000000"/>
+              <w:left w:val="single" w:sz="4" w:color="000000"/>
+              <w:bottom w:val="single" w:sz="4" w:color="000000"/>
+              <w:right w:val="single" w:sz="4" w:color="000000"/>
+            </w:tcBorders>
+          </w:tcPr>
+          <w:p>
+            <w:pPr>
+              <w:spacing w:after="0"/>
+              <w:jc w:val="center"/>
+            </w:pPr>
+            <w:r/>
+            <w:r>
+              <w:rPr>
+                <w:rFonts w:ascii="Times New Roman" w:hAnsi="Times New Roman"/>
+                <w:b w:val="0"/>
+                <w:sz w:val="15"/>
+              </w:rPr>
+              <w:t>0.594</w:t>
+            </w:r>
+          </w:p>
+        </w:tc>
+        <w:tc>
+          <w:tcPr>
+            <w:tcW w:type="dxa" w:w="936"/>
+            <w:tcBorders>
+              <w:top w:val="single" w:sz="4" w:color="000000"/>
+              <w:left w:val="single" w:sz="4" w:color="000000"/>
+              <w:bottom w:val="single" w:sz="4" w:color="000000"/>
+              <w:right w:val="single" w:sz="4" w:color="000000"/>
+            </w:tcBorders>
+          </w:tcPr>
+          <w:p>
+            <w:pPr>
+              <w:spacing w:after="0"/>
+              <w:jc w:val="center"/>
+            </w:pPr>
+            <w:r/>
+            <w:r>
+              <w:rPr>
+                <w:rFonts w:ascii="Times New Roman" w:hAnsi="Times New Roman"/>
+                <w:b w:val="0"/>
+                <w:sz w:val="15"/>
+              </w:rPr>
+              <w:t>0.411</w:t>
+            </w:r>
+          </w:p>
+        </w:tc>
+        <w:tc>
+          <w:tcPr>
+            <w:tcW w:type="dxa" w:w="936"/>
+            <w:tcBorders>
+              <w:top w:val="single" w:sz="4" w:color="000000"/>
+              <w:left w:val="single" w:sz="4" w:color="000000"/>
+              <w:bottom w:val="single" w:sz="4" w:color="000000"/>
+              <w:right w:val="single" w:sz="4" w:color="000000"/>
+            </w:tcBorders>
+          </w:tcPr>
+          <w:p>
+            <w:pPr>
+              <w:spacing w:after="0"/>
+              <w:jc w:val="center"/>
+            </w:pPr>
+            <w:r/>
+            <w:r>
+              <w:rPr>
+                <w:rFonts w:ascii="Times New Roman" w:hAnsi="Times New Roman"/>
+                <w:b w:val="0"/>
+                <w:sz w:val="15"/>
+              </w:rPr>
+              <w:t>0.388</w:t>
+            </w:r>
+          </w:p>
+        </w:tc>
+        <w:tc>
+          <w:tcPr>
+            <w:tcW w:type="dxa" w:w="1008"/>
+            <w:tcBorders>
+              <w:top w:val="single" w:sz="4" w:color="000000"/>
+              <w:left w:val="single" w:sz="4" w:color="000000"/>
+              <w:bottom w:val="single" w:sz="4" w:color="000000"/>
+              <w:right w:val="single" w:sz="4" w:color="000000"/>
+            </w:tcBorders>
+          </w:tcPr>
+          <w:p>
+            <w:pPr>
+              <w:spacing w:after="0"/>
+              <w:jc w:val="center"/>
+            </w:pPr>
+            <w:r/>
+            <w:r>
+              <w:rPr>
+                <w:rFonts w:ascii="Times New Roman" w:hAnsi="Times New Roman"/>
+                <w:b w:val="0"/>
+                <w:sz w:val="15"/>
+              </w:rPr>
+              <w:t>0.360</w:t>
+            </w:r>
+          </w:p>
+        </w:tc>
+      </w:tr>
+      <w:tr>
+        <w:tc>
+          <w:tcPr>
+            <w:tcW w:type="dxa" w:w="864"/>
+            <w:tcBorders>
+              <w:top w:val="single" w:sz="4" w:color="000000"/>
+              <w:left w:val="single" w:sz="4" w:color="000000"/>
+              <w:bottom w:val="single" w:sz="4" w:color="000000"/>
+              <w:right w:val="single" w:sz="4" w:color="000000"/>
+            </w:tcBorders>
+          </w:tcPr>
+          <w:p>
+            <w:pPr>
+              <w:spacing w:after="0"/>
+              <w:jc w:val="center"/>
+            </w:pPr>
+            <w:r/>
+            <w:r>
+              <w:rPr>
+                <w:rFonts w:ascii="Times New Roman" w:hAnsi="Times New Roman"/>
+                <w:b w:val="0"/>
+                <w:sz w:val="15"/>
+              </w:rPr>
+              <w:t>Rot</w:t>
+            </w:r>
+          </w:p>
+        </w:tc>
+        <w:tc>
+          <w:tcPr>
+            <w:tcW w:type="dxa" w:w="864"/>
+            <w:tcBorders>
+              <w:top w:val="single" w:sz="4" w:color="000000"/>
+              <w:left w:val="single" w:sz="4" w:color="000000"/>
+              <w:bottom w:val="single" w:sz="4" w:color="000000"/>
+              <w:right w:val="single" w:sz="4" w:color="000000"/>
+            </w:tcBorders>
+          </w:tcPr>
+          <w:p>
+            <w:pPr>
+              <w:spacing w:after="0"/>
+              <w:jc w:val="center"/>
+            </w:pPr>
+            <w:r/>
+            <w:r>
+              <w:rPr>
+                <w:rFonts w:ascii="Times New Roman" w:hAnsi="Times New Roman"/>
+                <w:b w:val="0"/>
+                <w:sz w:val="15"/>
+              </w:rPr>
+              <w:t>0.732</w:t>
+            </w:r>
+          </w:p>
+        </w:tc>
+        <w:tc>
+          <w:tcPr>
+            <w:tcW w:type="dxa" w:w="936"/>
+            <w:tcBorders>
+              <w:top w:val="single" w:sz="4" w:color="000000"/>
+              <w:left w:val="single" w:sz="4" w:color="000000"/>
+              <w:bottom w:val="single" w:sz="4" w:color="000000"/>
+              <w:right w:val="single" w:sz="4" w:color="000000"/>
+            </w:tcBorders>
+          </w:tcPr>
+          <w:p>
+            <w:pPr>
+              <w:spacing w:after="0"/>
+              <w:jc w:val="center"/>
+            </w:pPr>
+            <w:r/>
+            <w:r>
+              <w:rPr>
+                <w:rFonts w:ascii="Times New Roman" w:hAnsi="Times New Roman"/>
+                <w:b w:val="0"/>
+                <w:sz w:val="15"/>
+              </w:rPr>
+              <w:t>0.849</w:t>
+            </w:r>
+          </w:p>
+        </w:tc>
+        <w:tc>
+          <w:tcPr>
+            <w:tcW w:type="dxa" w:w="936"/>
+            <w:tcBorders>
+              <w:top w:val="single" w:sz="4" w:color="000000"/>
+              <w:left w:val="single" w:sz="4" w:color="000000"/>
+              <w:bottom w:val="single" w:sz="4" w:color="000000"/>
+              <w:right w:val="single" w:sz="4" w:color="000000"/>
+            </w:tcBorders>
+          </w:tcPr>
+          <w:p>
+            <w:pPr>
+              <w:spacing w:after="0"/>
+              <w:jc w:val="center"/>
+            </w:pPr>
+            <w:r/>
+            <w:r>
+              <w:rPr>
+                <w:rFonts w:ascii="Times New Roman" w:hAnsi="Times New Roman"/>
+                <w:b w:val="0"/>
+                <w:sz w:val="15"/>
+              </w:rPr>
+              <w:t>0.477</w:t>
+            </w:r>
+          </w:p>
+        </w:tc>
+        <w:tc>
+          <w:tcPr>
+            <w:tcW w:type="dxa" w:w="1008"/>
+            <w:tcBorders>
+              <w:top w:val="single" w:sz="4" w:color="000000"/>
+              <w:left w:val="single" w:sz="4" w:color="000000"/>
+              <w:bottom w:val="single" w:sz="4" w:color="000000"/>
+              <w:right w:val="single" w:sz="4" w:color="000000"/>
+            </w:tcBorders>
+          </w:tcPr>
+          <w:p>
+            <w:pPr>
+              <w:spacing w:after="0"/>
+              <w:jc w:val="center"/>
+            </w:pPr>
+            <w:r/>
+            <w:r>
+              <w:rPr>
+                <w:rFonts w:ascii="Times New Roman" w:hAnsi="Times New Roman"/>
+                <w:b w:val="0"/>
+                <w:sz w:val="15"/>
+              </w:rPr>
+              <w:t>0.442</w:t>
+            </w:r>
+          </w:p>
+        </w:tc>
+      </w:tr>
+      <w:tr>
+        <w:tc>
+          <w:tcPr>
+            <w:tcW w:type="dxa" w:w="864"/>
+            <w:tcBorders>
+              <w:top w:val="single" w:sz="4" w:color="000000"/>
+              <w:left w:val="single" w:sz="4" w:color="000000"/>
+              <w:bottom w:val="single" w:sz="4" w:color="000000"/>
+              <w:right w:val="single" w:sz="4" w:color="000000"/>
+            </w:tcBorders>
+          </w:tcPr>
+          <w:p>
+            <w:pPr>
+              <w:spacing w:after="0"/>
+              <w:jc w:val="center"/>
+            </w:pPr>
+            <w:r/>
+            <w:r>
+              <w:rPr>
+                <w:rFonts w:ascii="Times New Roman" w:hAnsi="Times New Roman"/>
+                <w:b w:val="0"/>
+                <w:sz w:val="15"/>
+              </w:rPr>
+              <w:t>Surface</w:t>
+            </w:r>
+          </w:p>
+        </w:tc>
+        <w:tc>
+          <w:tcPr>
+            <w:tcW w:type="dxa" w:w="864"/>
+            <w:tcBorders>
+              <w:top w:val="single" w:sz="4" w:color="000000"/>
+              <w:left w:val="single" w:sz="4" w:color="000000"/>
+              <w:bottom w:val="single" w:sz="4" w:color="000000"/>
+              <w:right w:val="single" w:sz="4" w:color="000000"/>
+            </w:tcBorders>
+          </w:tcPr>
+          <w:p>
+            <w:pPr>
+              <w:spacing w:after="0"/>
+              <w:jc w:val="center"/>
+            </w:pPr>
+            <w:r/>
+            <w:r>
+              <w:rPr>
+                <w:rFonts w:ascii="Times New Roman" w:hAnsi="Times New Roman"/>
+                <w:b w:val="0"/>
+                <w:sz w:val="15"/>
+              </w:rPr>
+              <w:t>0.511</w:t>
+            </w:r>
+          </w:p>
+        </w:tc>
+        <w:tc>
+          <w:tcPr>
+            <w:tcW w:type="dxa" w:w="936"/>
+            <w:tcBorders>
+              <w:top w:val="single" w:sz="4" w:color="000000"/>
+              <w:left w:val="single" w:sz="4" w:color="000000"/>
+              <w:bottom w:val="single" w:sz="4" w:color="000000"/>
+              <w:right w:val="single" w:sz="4" w:color="000000"/>
+            </w:tcBorders>
+          </w:tcPr>
+          <w:p>
+            <w:pPr>
+              <w:spacing w:after="0"/>
+              <w:jc w:val="center"/>
+            </w:pPr>
+            <w:r/>
+            <w:r>
+              <w:rPr>
+                <w:rFonts w:ascii="Times New Roman" w:hAnsi="Times New Roman"/>
+                <w:b w:val="0"/>
+                <w:sz w:val="15"/>
+              </w:rPr>
+              <w:t>0.497</w:t>
+            </w:r>
+          </w:p>
+        </w:tc>
+        <w:tc>
+          <w:tcPr>
+            <w:tcW w:type="dxa" w:w="936"/>
+            <w:tcBorders>
+              <w:top w:val="single" w:sz="4" w:color="000000"/>
+              <w:left w:val="single" w:sz="4" w:color="000000"/>
+              <w:bottom w:val="single" w:sz="4" w:color="000000"/>
+              <w:right w:val="single" w:sz="4" w:color="000000"/>
+            </w:tcBorders>
+          </w:tcPr>
+          <w:p>
+            <w:pPr>
+              <w:spacing w:after="0"/>
+              <w:jc w:val="center"/>
+            </w:pPr>
+            <w:r/>
+            <w:r>
+              <w:rPr>
+                <w:rFonts w:ascii="Times New Roman" w:hAnsi="Times New Roman"/>
+                <w:b w:val="0"/>
+                <w:sz w:val="15"/>
+              </w:rPr>
+              <w:t>0.314</w:t>
+            </w:r>
+          </w:p>
+        </w:tc>
+        <w:tc>
+          <w:tcPr>
+            <w:tcW w:type="dxa" w:w="1008"/>
+            <w:tcBorders>
+              <w:top w:val="single" w:sz="4" w:color="000000"/>
+              <w:left w:val="single" w:sz="4" w:color="000000"/>
+              <w:bottom w:val="single" w:sz="4" w:color="000000"/>
+              <w:right w:val="single" w:sz="4" w:color="000000"/>
+            </w:tcBorders>
+          </w:tcPr>
+          <w:p>
+            <w:pPr>
+              <w:spacing w:after="0"/>
+              <w:jc w:val="center"/>
+            </w:pPr>
+            <w:r/>
+            <w:r>
+              <w:rPr>
+                <w:rFonts w:ascii="Times New Roman" w:hAnsi="Times New Roman"/>
+                <w:b w:val="0"/>
+                <w:sz w:val="15"/>
+              </w:rPr>
+              <w:t>0.253</w:t>
+            </w:r>
+          </w:p>
+        </w:tc>
+      </w:tr>
+      <w:tr>
+        <w:tc>
+          <w:tcPr>
+            <w:tcW w:type="dxa" w:w="864"/>
+            <w:tcBorders>
+              <w:top w:val="single" w:sz="4" w:color="000000"/>
+              <w:left w:val="single" w:sz="4" w:color="000000"/>
+              <w:bottom w:val="single" w:sz="4" w:color="000000"/>
+              <w:right w:val="single" w:sz="4" w:color="000000"/>
+            </w:tcBorders>
+          </w:tcPr>
+          <w:p>
+            <w:pPr>
+              <w:spacing w:after="0"/>
+              <w:jc w:val="center"/>
+            </w:pPr>
+            <w:r/>
+            <w:r>
+              <w:rPr>
+                <w:rFonts w:ascii="Times New Roman" w:hAnsi="Times New Roman"/>
+                <w:b w:val="0"/>
+                <w:sz w:val="15"/>
+              </w:rPr>
+              <w:t>All</w:t>
+            </w:r>
+          </w:p>
+        </w:tc>
+        <w:tc>
+          <w:tcPr>
+            <w:tcW w:type="dxa" w:w="864"/>
+            <w:tcBorders>
+              <w:top w:val="single" w:sz="4" w:color="000000"/>
+              <w:left w:val="single" w:sz="4" w:color="000000"/>
+              <w:bottom w:val="single" w:sz="4" w:color="000000"/>
+              <w:right w:val="single" w:sz="4" w:color="000000"/>
+            </w:tcBorders>
+          </w:tcPr>
+          <w:p>
+            <w:pPr>
+              <w:spacing w:after="0"/>
+              <w:jc w:val="center"/>
+            </w:pPr>
+            <w:r/>
+            <w:r>
+              <w:rPr>
+                <w:rFonts w:ascii="Times New Roman" w:hAnsi="Times New Roman"/>
+                <w:b w:val="0"/>
+                <w:sz w:val="15"/>
+              </w:rPr>
+              <w:t>0.613</w:t>
+            </w:r>
+          </w:p>
+        </w:tc>
+        <w:tc>
+          <w:tcPr>
+            <w:tcW w:type="dxa" w:w="936"/>
+            <w:tcBorders>
+              <w:top w:val="single" w:sz="4" w:color="000000"/>
+              <w:left w:val="single" w:sz="4" w:color="000000"/>
+              <w:bottom w:val="single" w:sz="4" w:color="000000"/>
+              <w:right w:val="single" w:sz="4" w:color="000000"/>
+            </w:tcBorders>
+          </w:tcPr>
+          <w:p>
+            <w:pPr>
+              <w:spacing w:after="0"/>
+              <w:jc w:val="center"/>
+            </w:pPr>
+            <w:r/>
+            <w:r>
+              <w:rPr>
+                <w:rFonts w:ascii="Times New Roman" w:hAnsi="Times New Roman"/>
+                <w:b w:val="0"/>
+                <w:sz w:val="15"/>
+              </w:rPr>
+              <w:t>0.586</w:t>
+            </w:r>
+          </w:p>
+        </w:tc>
+        <w:tc>
+          <w:tcPr>
+            <w:tcW w:type="dxa" w:w="936"/>
+            <w:tcBorders>
+              <w:top w:val="single" w:sz="4" w:color="000000"/>
+              <w:left w:val="single" w:sz="4" w:color="000000"/>
+              <w:bottom w:val="single" w:sz="4" w:color="000000"/>
+              <w:right w:val="single" w:sz="4" w:color="000000"/>
+            </w:tcBorders>
+          </w:tcPr>
+          <w:p>
+            <w:pPr>
+              <w:spacing w:after="0"/>
+              <w:jc w:val="center"/>
+            </w:pPr>
+            <w:r/>
+            <w:r>
+              <w:rPr>
+                <w:rFonts w:ascii="Times New Roman" w:hAnsi="Times New Roman"/>
+                <w:b w:val="0"/>
+                <w:sz w:val="15"/>
+              </w:rPr>
+              <w:t>0.393</w:t>
+            </w:r>
+          </w:p>
+        </w:tc>
+        <w:tc>
+          <w:tcPr>
+            <w:tcW w:type="dxa" w:w="1008"/>
+            <w:tcBorders>
+              <w:top w:val="single" w:sz="4" w:color="000000"/>
+              <w:left w:val="single" w:sz="4" w:color="000000"/>
+              <w:bottom w:val="single" w:sz="4" w:color="000000"/>
+              <w:right w:val="single" w:sz="4" w:color="000000"/>
+            </w:tcBorders>
+          </w:tcPr>
+          <w:p>
+            <w:pPr>
+              <w:spacing w:after="0"/>
+              <w:jc w:val="center"/>
+            </w:pPr>
+            <w:r/>
+            <w:r>
+              <w:rPr>
+                <w:rFonts w:ascii="Times New Roman" w:hAnsi="Times New Roman"/>
+                <w:b w:val="0"/>
+                <w:sz w:val="15"/>
+              </w:rPr>
+              <w:t>0.352</w:t>
+            </w:r>
+          </w:p>
+        </w:tc>
+      </w:tr>
+    </w:tbl>
+    <w:p>
+      <w:pPr>
+        <w:spacing w:after="40"/>
+        <w:jc w:val="both"/>
+      </w:pPr>
+      <w:r>
+        <w:rPr>
+          <w:rFonts w:ascii="Times New Roman" w:hAnsi="Times New Roman"/>
+          <w:b w:val="0"/>
+          <w:i w:val="0"/>
+          <w:sz w:val="20"/>
+        </w:rPr>
       </w:r>
     </w:p>
     <w:p>
@@ -5246,7 +7148,7 @@
         <w:pStyle w:val="Heading2"/>
       </w:pPr>
       <w:r>
-        <w:t>F. Web Application</w:t>
+        <w:t>F. Errors and Limits</w:t>
       </w:r>
     </w:p>
     <w:p>
@@ -5262,15 +7164,15 @@
           <w:i w:val="0"/>
           <w:sz w:val="20"/>
         </w:rPr>
-        <w:t>A Streamlit application loads the Stage 1 and Stage 2 checkpoints for the selected fruit. Users upload a photo or pick a sample. The app overlays colored defect masks with a legend and reports each defect class with its share of the image and of the Stage 1 fruit mask. A confidence slider, class toggles, inference time and a PNG download are included. Unreadable files and images with no defect produce clear messages.</w:t>
-      </w:r>
-    </w:p>
-    <w:p>
-      <w:pPr>
-        <w:pStyle w:val="Heading1"/>
-      </w:pPr>
-      <w:r>
-        <w:t>VI. CONCLUSION AND FUTURE WORK</w:t>
+        <w:t>Surface damage is the hardest class because it covers small scars, cuts and dry spots with weak contrast. The confusion matrices show that most errors are missed defects predicted as background. Bruise and rot are rarely confused with each other. On validation most false positives are surface damage predicted on marks the team did not label. The images come from a few sources with mostly plain backgrounds. Performance on new lighting, cultivars or conveyor images is unknown. Capture groups did not catch repeated Lab2Wild views of the same apple, so some near-duplicates cross splits. A perceptual-hash grouping should be applied before the split in future work. Classes describe appearance only and the model does not diagnose disease or internal damage.</w:t>
+      </w:r>
+    </w:p>
+    <w:p>
+      <w:pPr>
+        <w:pStyle w:val="Heading2"/>
+      </w:pPr>
+      <w:r>
+        <w:t>G. Web Application</w:t>
       </w:r>
     </w:p>
     <w:p>
@@ -5286,6 +7188,30 @@
           <w:i w:val="0"/>
           <w:sz w:val="20"/>
         </w:rPr>
+        <w:t>A Streamlit application loads the Stage 1 and Stage 2 checkpoints for the selected model: apple, tomato or the combined model. Users upload a photo or pick a sample. The app overlays colored defect masks with a legend and reports each defect class with its share of the image and of the Stage 1 fruit mask. A confidence slider, class toggles, inference time and a PNG download are included. Unreadable files and images with no defect produce clear messages.</w:t>
+      </w:r>
+    </w:p>
+    <w:p>
+      <w:pPr>
+        <w:pStyle w:val="Heading1"/>
+      </w:pPr>
+      <w:r>
+        <w:t>VI. CONCLUSION AND FUTURE WORK</w:t>
+      </w:r>
+    </w:p>
+    <w:p>
+      <w:pPr>
+        <w:spacing w:after="80"/>
+        <w:ind w:firstLine="200"/>
+        <w:jc w:val="both"/>
+      </w:pPr>
+      <w:r>
+        <w:rPr>
+          <w:rFonts w:ascii="Times New Roman" w:hAnsi="Times New Roman"/>
+          <w:b w:val="0"/>
+          <w:i w:val="0"/>
+          <w:sz w:val="20"/>
+        </w:rPr>
         <w:t xml:space="preserve">A two-stage YOLO26l model trained on team-reviewed masks segments the whole apple almost perfectly and segments three visible defect classes with </w:t>
       </w:r>
       <w:r>
@@ -5322,7 +7248,25 @@
           <w:i w:val="0"/>
           <w:sz w:val="20"/>
         </w:rPr>
-        <w:t xml:space="preserve"> mask mAP50 on the test split, or 50.4% on test images with no near-duplicate in training. Rot was the most stable class and surface damage the hardest. Future work should add more reviewed small-defect examples, regroup the data by perceptual hash before splitting, run a controlled single-stage baseline with identical settings, test on images from new sources and measure agreement between annotators.</w:t>
+        <w:t xml:space="preserve"> mask mAP50 on the test split, or 50.4% on test images with no near-duplicate in training. Rot was the most stable class and surface damage the hardest. The tomato model reached </w:t>
+      </w:r>
+      <w:r>
+        <w:rPr>
+          <w:rFonts w:ascii="Times New Roman" w:hAnsi="Times New Roman"/>
+          <w:b w:val="0"/>
+          <w:i w:val="0"/>
+          <w:sz w:val="20"/>
+        </w:rPr>
+        <w:t>39.3%</w:t>
+      </w:r>
+      <w:r>
+        <w:rPr>
+          <w:rFonts w:ascii="Times New Roman" w:hAnsi="Times New Roman"/>
+          <w:b w:val="0"/>
+          <w:i w:val="0"/>
+          <w:sz w:val="20"/>
+        </w:rPr>
+        <w:t xml:space="preserve"> test mask mAP50 and misses most tomato defects. One combined model for both fruits scored slightly below the separate models on test. Future work should add more reviewed small-defect examples, regroup the data by perceptual hash before splitting, run a controlled single-stage baseline with identical settings, test on images from new sources and measure agreement between annotators.</w:t>
       </w:r>
     </w:p>
     <w:p>

</xml_diff>

<commit_message>
Tomato near-duplicate check, tomato samples, AI transcript and final document rebuild
Co-Authored-By: Claude Opus 5.5 <noreply@anthropic.com>
</commit_message>
<xml_diff>
--- a/paper/CIPHER_AI2_IEEE_Paper.docx
+++ b/paper/CIPHER_AI2_IEEE_Paper.docx
@@ -1275,7 +1275,7 @@
           <w:i w:val="0"/>
           <w:sz w:val="20"/>
         </w:rPr>
-        <w:t>Apple images come from three sources. AFruitDB grading photos [1] supply 986 training files. The Lab2Wild apple rot set by Nesteruk [9] supplies 843. Photos taken by the team supply 281. The original AFruitDB grade folders are image-level labels and were not used as training targets. All pixel masks were drawn by the team. Tomato images come from AFruitDB [1] and team captures. The tomato set has 1,313 training files from 459 capture groups, 132 validation images, 95 test images and a 39-image reserve.</w:t>
+        <w:t>Apple images come from three sources. AFruitDB grading photos [1] supply 986 training files. The Lab2Wild apple rot set by Nesteruk [9] supplies 843. Photos taken by the team supply 281. The original AFruitDB grade folders are image-level labels and were not used as training targets. All pixel masks were drawn by the team. Tomato images come from the team Roboflow tomato project, whose export declares CC BY 4.0. The tomato set has 1,313 training files from 459 capture groups, 132 validation images, 95 test images and a 39-image reserve.</w:t>
       </w:r>
     </w:p>
     <w:p>
@@ -5600,7 +5600,7 @@
           <w:i w:val="0"/>
           <w:sz w:val="20"/>
         </w:rPr>
-        <w:t>. When the model marks a tomato defect it is usually right but it misses most of them. Table VI gives per-class results. Tomato has fewer training files than apple (1,313 against 2,110) from fewer capture groups (459 against 726). An earlier joint model (Run 11) also found tomato defects the weakest part of the project. The near-duplicate check used for apple has not yet been run on the tomato splits, so the tomato test score may also be optimistic.</w:t>
+        <w:t>. When the model marks a tomato defect it is usually right but it misses most of them. Table VI gives per-class results. Tomato has fewer training files than apple (1,313 against 2,110) from fewer capture groups (459 against 726). An earlier joint model (Run 11) also found tomato defects the weakest part of the project. The near-duplicate check used for apple found no tomato test image with a near-duplicate in training and one such validation image out of 132, so the tomato test score is not inflated by repeated views.</w:t>
       </w:r>
     </w:p>
     <w:p>

</xml_diff>